<commit_message>
updated with failure scenarios
</commit_message>
<xml_diff>
--- a/system_design/click_stream.docx
+++ b/system_design/click_stream.docx
@@ -2143,6 +2143,9 @@
     <w:p>
       <w:pPr>
         <w:pStyle w:val="HTMLPreformatted"/>
+        <w:rPr>
+          <w:rStyle w:val="HTMLCode"/>
+        </w:rPr>
       </w:pPr>
       <w:r>
         <w:rPr>
@@ -2153,6 +2156,49 @@
     </w:p>
     <w:p>
       <w:pPr>
+        <w:pStyle w:val="HTMLPreformatted"/>
+        <w:rPr>
+          <w:rStyle w:val="HTMLCode"/>
+        </w:rPr>
+      </w:pPr>
+    </w:p>
+    <w:p>
+      <w:pPr>
+        <w:pStyle w:val="HTMLPreformatted"/>
+      </w:pPr>
+      <w:r>
+        <w:rPr>
+          <w:rStyle w:val="HTMLCode"/>
+        </w:rPr>
+        <w:t>Raw</w:t>
+      </w:r>
+      <w:r>
+        <w:rPr>
+          <w:rStyle w:val="HTMLCode"/>
+        </w:rPr>
+        <w:sym w:font="Wingdings" w:char="F0E0"/>
+      </w:r>
+      <w:r>
+        <w:rPr>
+          <w:rStyle w:val="HTMLCode"/>
+        </w:rPr>
+        <w:t xml:space="preserve"> stage</w:t>
+      </w:r>
+      <w:r>
+        <w:rPr>
+          <w:rStyle w:val="HTMLCode"/>
+        </w:rPr>
+        <w:sym w:font="Wingdings" w:char="F0E0"/>
+      </w:r>
+      <w:r>
+        <w:rPr>
+          <w:rStyle w:val="HTMLCode"/>
+        </w:rPr>
+        <w:t xml:space="preserve"> consumption</w:t>
+      </w:r>
+    </w:p>
+    <w:p>
+      <w:pPr>
         <w:pStyle w:val="NormalWeb"/>
       </w:pPr>
       <w:r>
@@ -2346,6 +2392,7 @@
         <w:rPr>
           <w:rStyle w:val="HTMLCode"/>
         </w:rPr>
+        <w:lastRenderedPageBreak/>
         <w:t xml:space="preserve">ON </w:t>
       </w:r>
       <w:proofErr w:type="spellStart"/>
@@ -2403,7 +2450,6 @@
         <w:pStyle w:val="NormalWeb"/>
       </w:pPr>
       <w:r>
-        <w:lastRenderedPageBreak/>
         <w:t>Iceberg does not edit a Parquet file in place. It writes replacement data files and then atomically publishes a new snapshot. Readers either see the old valid snapshot or the new valid snapshot—not a half-written table.</w:t>
       </w:r>
     </w:p>
@@ -6890,119 +6936,7 @@
         <mc:AlternateContent>
           <mc:Choice Requires="wps">
             <w:drawing>
-              <wp:anchor distT="0" distB="0" distL="114300" distR="114300" simplePos="0" relativeHeight="251679744" behindDoc="0" locked="0" layoutInCell="1" allowOverlap="1" wp14:anchorId="01B47914" wp14:editId="5DC21314">
-                <wp:simplePos x="0" y="0"/>
-                <wp:positionH relativeFrom="column">
-                  <wp:posOffset>1972650</wp:posOffset>
-                </wp:positionH>
-                <wp:positionV relativeFrom="paragraph">
-                  <wp:posOffset>1448085</wp:posOffset>
-                </wp:positionV>
-                <wp:extent cx="928800" cy="583200"/>
-                <wp:effectExtent l="0" t="0" r="11430" b="13970"/>
-                <wp:wrapNone/>
-                <wp:docPr id="1126005656" name="Text Box 1"/>
-                <wp:cNvGraphicFramePr/>
-                <a:graphic xmlns:a="http://schemas.openxmlformats.org/drawingml/2006/main">
-                  <a:graphicData uri="http://schemas.microsoft.com/office/word/2010/wordprocessingShape">
-                    <wps:wsp>
-                      <wps:cNvSpPr txBox="1"/>
-                      <wps:spPr>
-                        <a:xfrm>
-                          <a:off x="0" y="0"/>
-                          <a:ext cx="928800" cy="583200"/>
-                        </a:xfrm>
-                        <a:prstGeom prst="rect">
-                          <a:avLst/>
-                        </a:prstGeom>
-                        <a:solidFill>
-                          <a:schemeClr val="lt1"/>
-                        </a:solidFill>
-                        <a:ln w="6350">
-                          <a:solidFill>
-                            <a:prstClr val="black"/>
-                          </a:solidFill>
-                        </a:ln>
-                      </wps:spPr>
-                      <wps:txbx>
-                        <w:txbxContent>
-                          <w:p>
-                            <w:r>
-                              <w:t xml:space="preserve">s3 </w:t>
-                            </w:r>
-                            <w:r>
-                              <w:t>silver -</w:t>
-                            </w:r>
-                            <w:proofErr w:type="spellStart"/>
-                            <w:r>
-                              <w:t>event_id</w:t>
-                            </w:r>
-                            <w:proofErr w:type="spellEnd"/>
-                            <w:r>
-                              <w:t xml:space="preserve"> </w:t>
-                            </w:r>
-                          </w:p>
-                        </w:txbxContent>
-                      </wps:txbx>
-                      <wps:bodyPr rot="0" spcFirstLastPara="0" vertOverflow="overflow" horzOverflow="overflow" vert="horz" wrap="square" lIns="91440" tIns="45720" rIns="91440" bIns="45720" numCol="1" spcCol="0" rtlCol="0" fromWordArt="0" anchor="t" anchorCtr="0" forceAA="0" compatLnSpc="1">
-                        <a:prstTxWarp prst="textNoShape">
-                          <a:avLst/>
-                        </a:prstTxWarp>
-                        <a:noAutofit/>
-                      </wps:bodyPr>
-                    </wps:wsp>
-                  </a:graphicData>
-                </a:graphic>
-                <wp14:sizeRelH relativeFrom="margin">
-                  <wp14:pctWidth>0</wp14:pctWidth>
-                </wp14:sizeRelH>
-                <wp14:sizeRelV relativeFrom="margin">
-                  <wp14:pctHeight>0</wp14:pctHeight>
-                </wp14:sizeRelV>
-              </wp:anchor>
-            </w:drawing>
-          </mc:Choice>
-          <mc:Fallback>
-            <w:pict>
-              <v:shapetype w14:anchorId="01B47914" id="_x0000_t202" coordsize="21600,21600" o:spt="202" path="m,l,21600r21600,l21600,xe">
-                <v:stroke joinstyle="miter"/>
-                <v:path gradientshapeok="t" o:connecttype="rect"/>
-              </v:shapetype>
-              <v:shape id="Text Box 1" o:spid="_x0000_s1026" type="#_x0000_t202" style="position:absolute;margin-left:155.35pt;margin-top:114pt;width:73.15pt;height:45.9pt;z-index:251679744;visibility:visible;mso-wrap-style:square;mso-width-percent:0;mso-height-percent:0;mso-wrap-distance-left:9pt;mso-wrap-distance-top:0;mso-wrap-distance-right:9pt;mso-wrap-distance-bottom:0;mso-position-horizontal:absolute;mso-position-horizontal-relative:text;mso-position-vertical:absolute;mso-position-vertical-relative:text;mso-width-percent:0;mso-height-percent:0;mso-width-relative:margin;mso-height-relative:margin;v-text-anchor:top" o:gfxdata="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" fillcolor="white [3201]" strokeweight=".5pt">
-                <v:textbox>
-                  <w:txbxContent>
-                    <w:p>
-                      <w:r>
-                        <w:t xml:space="preserve">s3 </w:t>
-                      </w:r>
-                      <w:r>
-                        <w:t>silver -</w:t>
-                      </w:r>
-                      <w:proofErr w:type="spellStart"/>
-                      <w:r>
-                        <w:t>event_id</w:t>
-                      </w:r>
-                      <w:proofErr w:type="spellEnd"/>
-                      <w:r>
-                        <w:t xml:space="preserve"> </w:t>
-                      </w:r>
-                    </w:p>
-                  </w:txbxContent>
-                </v:textbox>
-              </v:shape>
-            </w:pict>
-          </mc:Fallback>
-        </mc:AlternateContent>
-      </w:r>
-      <w:r>
-        <w:rPr>
-          <w:noProof/>
-          <w14:ligatures w14:val="standardContextual"/>
-        </w:rPr>
-        <mc:AlternateContent>
-          <mc:Choice Requires="wps">
-            <w:drawing>
-              <wp:anchor distT="0" distB="0" distL="114300" distR="114300" simplePos="0" relativeHeight="251677696" behindDoc="0" locked="0" layoutInCell="1" allowOverlap="1" wp14:anchorId="6C9F3AB1" wp14:editId="5E583EDA">
+              <wp:anchor distT="0" distB="0" distL="114300" distR="114300" simplePos="0" relativeHeight="251677696" behindDoc="0" locked="0" layoutInCell="1" allowOverlap="1" wp14:anchorId="6C9F3AB1" wp14:editId="79395B8B">
                 <wp:simplePos x="0" y="0"/>
                 <wp:positionH relativeFrom="column">
                   <wp:posOffset>2901050</wp:posOffset>
@@ -7060,7 +6994,7 @@
           </mc:Choice>
           <mc:Fallback>
             <w:pict>
-              <v:shapetype w14:anchorId="6CA44AA5" id="_x0000_t32" coordsize="21600,21600" o:spt="32" o:oned="t" path="m,l21600,21600e" filled="f">
+              <v:shapetype w14:anchorId="104B801B" id="_x0000_t32" coordsize="21600,21600" o:spt="32" o:oned="t" path="m,l21600,21600e" filled="f">
                 <v:path arrowok="t" fillok="f" o:connecttype="none"/>
                 <o:lock v:ext="edit" shapetype="t"/>
               </v:shapetype>
@@ -7117,13 +7051,8 @@
                         <w:txbxContent>
                           <w:p>
                             <w:r>
-                              <w:t xml:space="preserve">Validation + deduplication on </w:t>
+                              <w:t>Validation + deduplication on event_id</w:t>
                             </w:r>
-                            <w:proofErr w:type="spellStart"/>
-                            <w:r>
-                              <w:t>event_id</w:t>
-                            </w:r>
-                            <w:proofErr w:type="spellEnd"/>
                           </w:p>
                         </w:txbxContent>
                       </wps:txbx>
@@ -7147,18 +7076,17 @@
           </mc:Choice>
           <mc:Fallback>
             <w:pict>
-              <v:shape w14:anchorId="0DF8DF12" id="_x0000_s1027" type="#_x0000_t202" style="position:absolute;margin-left:284.05pt;margin-top:109.45pt;width:93.5pt;height:51.6pt;z-index:251675648;visibility:visible;mso-wrap-style:square;mso-width-percent:0;mso-height-percent:0;mso-wrap-distance-left:9pt;mso-wrap-distance-top:0;mso-wrap-distance-right:9pt;mso-wrap-distance-bottom:0;mso-position-horizontal:absolute;mso-position-horizontal-relative:text;mso-position-vertical:absolute;mso-position-vertical-relative:text;mso-width-percent:0;mso-height-percent:0;mso-width-relative:margin;mso-height-relative:margin;v-text-anchor:top" o:gfxdata="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" fillcolor="white [3201]" strokeweight=".5pt">
+              <v:shapetype w14:anchorId="0DF8DF12" id="_x0000_t202" coordsize="21600,21600" o:spt="202" path="m,l,21600r21600,l21600,xe">
+                <v:stroke joinstyle="miter"/>
+                <v:path gradientshapeok="t" o:connecttype="rect"/>
+              </v:shapetype>
+              <v:shape id="Text Box 1" o:spid="_x0000_s1026" type="#_x0000_t202" style="position:absolute;margin-left:284.05pt;margin-top:109.45pt;width:93.5pt;height:51.6pt;z-index:251675648;visibility:visible;mso-wrap-style:square;mso-width-percent:0;mso-height-percent:0;mso-wrap-distance-left:9pt;mso-wrap-distance-top:0;mso-wrap-distance-right:9pt;mso-wrap-distance-bottom:0;mso-position-horizontal:absolute;mso-position-horizontal-relative:text;mso-position-vertical:absolute;mso-position-vertical-relative:text;mso-width-percent:0;mso-height-percent:0;mso-width-relative:margin;mso-height-relative:margin;v-text-anchor:top" o:gfxdata="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" fillcolor="white [3201]" strokeweight=".5pt">
                 <v:textbox>
                   <w:txbxContent>
                     <w:p>
                       <w:r>
-                        <w:t xml:space="preserve">Validation + deduplication on </w:t>
+                        <w:t>Validation + deduplication on event_id</w:t>
                       </w:r>
-                      <w:proofErr w:type="spellStart"/>
-                      <w:r>
-                        <w:t>event_id</w:t>
-                      </w:r>
-                      <w:proofErr w:type="spellEnd"/>
                     </w:p>
                   </w:txbxContent>
                 </v:textbox>
@@ -7311,7 +7239,7 @@
           </mc:Choice>
           <mc:Fallback>
             <w:pict>
-              <v:shape w14:anchorId="5D4B65A5" id="_x0000_s1028" type="#_x0000_t202" style="position:absolute;margin-left:134.95pt;margin-top:8.55pt;width:93.5pt;height:36.85pt;z-index:251666432;visibility:visible;mso-wrap-style:square;mso-width-percent:0;mso-height-percent:0;mso-wrap-distance-left:9pt;mso-wrap-distance-top:0;mso-wrap-distance-right:9pt;mso-wrap-distance-bottom:0;mso-position-horizontal:absolute;mso-position-horizontal-relative:text;mso-position-vertical:absolute;mso-position-vertical-relative:text;mso-width-percent:0;mso-height-percent:0;mso-width-relative:margin;mso-height-relative:margin;v-text-anchor:top" o:gfxdata="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" fillcolor="white [3201]" strokeweight=".5pt">
+              <v:shape w14:anchorId="5D4B65A5" id="_x0000_s1027" type="#_x0000_t202" style="position:absolute;margin-left:134.95pt;margin-top:8.55pt;width:93.5pt;height:36.85pt;z-index:251666432;visibility:visible;mso-wrap-style:square;mso-width-percent:0;mso-height-percent:0;mso-wrap-distance-left:9pt;mso-wrap-distance-top:0;mso-wrap-distance-right:9pt;mso-wrap-distance-bottom:0;mso-position-horizontal:absolute;mso-position-horizontal-relative:text;mso-position-vertical:absolute;mso-position-vertical-relative:text;mso-width-percent:0;mso-height-percent:0;mso-width-relative:margin;mso-height-relative:margin;v-text-anchor:top" o:gfxdata="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" fillcolor="white [3201]" strokeweight=".5pt">
                 <v:textbox>
                   <w:txbxContent>
                     <w:p>
@@ -7397,7 +7325,7 @@
           </mc:Choice>
           <mc:Fallback>
             <w:pict>
-              <v:shape w14:anchorId="7100D069" id="_x0000_s1029" type="#_x0000_t202" style="position:absolute;margin-left:301.6pt;margin-top:11.95pt;width:73.15pt;height:45.9pt;z-index:251671552;visibility:visible;mso-wrap-style:square;mso-width-percent:0;mso-height-percent:0;mso-wrap-distance-left:9pt;mso-wrap-distance-top:0;mso-wrap-distance-right:9pt;mso-wrap-distance-bottom:0;mso-position-horizontal:absolute;mso-position-horizontal-relative:text;mso-position-vertical:absolute;mso-position-vertical-relative:text;mso-width-percent:0;mso-height-percent:0;mso-width-relative:margin;mso-height-relative:margin;v-text-anchor:top" o:gfxdata="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" fillcolor="white [3201]" strokeweight=".5pt">
+              <v:shape w14:anchorId="7100D069" id="_x0000_s1028" type="#_x0000_t202" style="position:absolute;margin-left:301.6pt;margin-top:11.95pt;width:73.15pt;height:45.9pt;z-index:251671552;visibility:visible;mso-wrap-style:square;mso-width-percent:0;mso-height-percent:0;mso-wrap-distance-left:9pt;mso-wrap-distance-top:0;mso-wrap-distance-right:9pt;mso-wrap-distance-bottom:0;mso-position-horizontal:absolute;mso-position-horizontal-relative:text;mso-position-vertical:absolute;mso-position-vertical-relative:text;mso-width-percent:0;mso-height-percent:0;mso-width-relative:margin;mso-height-relative:margin;v-text-anchor:top" o:gfxdata="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" fillcolor="white [3201]" strokeweight=".5pt">
                 <v:textbox>
                   <w:txbxContent>
                     <w:p>
@@ -7611,7 +7539,7 @@
           </mc:Choice>
           <mc:Fallback>
             <w:pict>
-              <v:shape w14:anchorId="44CCEFC9" id="_x0000_s1030" type="#_x0000_t202" style="position:absolute;margin-left:1.7pt;margin-top:9.1pt;width:57.25pt;height:33.45pt;z-index:251664384;visibility:visible;mso-wrap-style:square;mso-wrap-distance-left:9pt;mso-wrap-distance-top:0;mso-wrap-distance-right:9pt;mso-wrap-distance-bottom:0;mso-position-horizontal:absolute;mso-position-horizontal-relative:text;mso-position-vertical:absolute;mso-position-vertical-relative:text;v-text-anchor:top" o:gfxdata="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" fillcolor="white [3201]" strokeweight=".5pt">
+              <v:shape w14:anchorId="44CCEFC9" id="_x0000_s1029" type="#_x0000_t202" style="position:absolute;margin-left:1.7pt;margin-top:9.1pt;width:57.25pt;height:33.45pt;z-index:251664384;visibility:visible;mso-wrap-style:square;mso-wrap-distance-left:9pt;mso-wrap-distance-top:0;mso-wrap-distance-right:9pt;mso-wrap-distance-bottom:0;mso-position-horizontal:absolute;mso-position-horizontal-relative:text;mso-position-vertical:absolute;mso-position-vertical-relative:text;v-text-anchor:top" o:gfxdata="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" fillcolor="white [3201]" strokeweight=".5pt">
                 <v:textbox>
                   <w:txbxContent>
                     <w:p>
@@ -7755,11 +7683,9 @@
                       <wps:txbx>
                         <w:txbxContent>
                           <w:p>
-                            <w:proofErr w:type="spellStart"/>
                             <w:r>
                               <w:t>athena</w:t>
                             </w:r>
-                            <w:proofErr w:type="spellEnd"/>
                           </w:p>
                         </w:txbxContent>
                       </wps:txbx>
@@ -7777,15 +7703,13 @@
           </mc:Choice>
           <mc:Fallback>
             <w:pict>
-              <v:shape w14:anchorId="1F1A2071" id="_x0000_s1031" type="#_x0000_t202" style="position:absolute;margin-left:59.05pt;margin-top:113.05pt;width:57.25pt;height:33.45pt;z-index:251685888;visibility:visible;mso-wrap-style:square;mso-wrap-distance-left:9pt;mso-wrap-distance-top:0;mso-wrap-distance-right:9pt;mso-wrap-distance-bottom:0;mso-position-horizontal:absolute;mso-position-horizontal-relative:text;mso-position-vertical:absolute;mso-position-vertical-relative:text;v-text-anchor:top" o:gfxdata="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" fillcolor="white [3201]" strokeweight=".5pt">
+              <v:shape w14:anchorId="1F1A2071" id="_x0000_s1030" type="#_x0000_t202" style="position:absolute;margin-left:59.05pt;margin-top:113.05pt;width:57.25pt;height:33.45pt;z-index:251685888;visibility:visible;mso-wrap-style:square;mso-wrap-distance-left:9pt;mso-wrap-distance-top:0;mso-wrap-distance-right:9pt;mso-wrap-distance-bottom:0;mso-position-horizontal:absolute;mso-position-horizontal-relative:text;mso-position-vertical:absolute;mso-position-vertical-relative:text;v-text-anchor:top" o:gfxdata="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" fillcolor="white [3201]" strokeweight=".5pt">
                 <v:textbox>
                   <w:txbxContent>
                     <w:p>
-                      <w:proofErr w:type="spellStart"/>
                       <w:r>
                         <w:t>athena</w:t>
                       </w:r>
-                      <w:proofErr w:type="spellEnd"/>
                     </w:p>
                   </w:txbxContent>
                 </v:textbox>
@@ -7887,6 +7811,104 @@
       <w:pPr>
         <w:spacing w:after="160" w:line="278" w:lineRule="auto"/>
       </w:pPr>
+      <w:r>
+        <w:rPr>
+          <w:noProof/>
+          <w14:ligatures w14:val="standardContextual"/>
+        </w:rPr>
+        <mc:AlternateContent>
+          <mc:Choice Requires="wps">
+            <w:drawing>
+              <wp:anchor distT="0" distB="0" distL="114300" distR="114300" simplePos="0" relativeHeight="251679744" behindDoc="0" locked="0" layoutInCell="1" allowOverlap="1" wp14:anchorId="01B47914" wp14:editId="6C49C190">
+                <wp:simplePos x="0" y="0"/>
+                <wp:positionH relativeFrom="column">
+                  <wp:posOffset>1972800</wp:posOffset>
+                </wp:positionH>
+                <wp:positionV relativeFrom="paragraph">
+                  <wp:posOffset>220700</wp:posOffset>
+                </wp:positionV>
+                <wp:extent cx="1130400" cy="662400"/>
+                <wp:effectExtent l="0" t="0" r="12700" b="10795"/>
+                <wp:wrapNone/>
+                <wp:docPr id="1126005656" name="Text Box 1"/>
+                <wp:cNvGraphicFramePr/>
+                <a:graphic xmlns:a="http://schemas.openxmlformats.org/drawingml/2006/main">
+                  <a:graphicData uri="http://schemas.microsoft.com/office/word/2010/wordprocessingShape">
+                    <wps:wsp>
+                      <wps:cNvSpPr txBox="1"/>
+                      <wps:spPr>
+                        <a:xfrm>
+                          <a:off x="0" y="0"/>
+                          <a:ext cx="1130400" cy="662400"/>
+                        </a:xfrm>
+                        <a:prstGeom prst="rect">
+                          <a:avLst/>
+                        </a:prstGeom>
+                        <a:solidFill>
+                          <a:schemeClr val="lt1"/>
+                        </a:solidFill>
+                        <a:ln w="6350">
+                          <a:solidFill>
+                            <a:prstClr val="black"/>
+                          </a:solidFill>
+                        </a:ln>
+                      </wps:spPr>
+                      <wps:txbx>
+                        <w:txbxContent>
+                          <w:p>
+                            <w:r>
+                              <w:t>s3 silver -</w:t>
+                            </w:r>
+                            <w:r>
+                              <w:t xml:space="preserve">deduplication by </w:t>
+                            </w:r>
+                            <w:r>
+                              <w:t xml:space="preserve">event_id </w:t>
+                            </w:r>
+                          </w:p>
+                        </w:txbxContent>
+                      </wps:txbx>
+                      <wps:bodyPr rot="0" spcFirstLastPara="0" vertOverflow="overflow" horzOverflow="overflow" vert="horz" wrap="square" lIns="91440" tIns="45720" rIns="91440" bIns="45720" numCol="1" spcCol="0" rtlCol="0" fromWordArt="0" anchor="t" anchorCtr="0" forceAA="0" compatLnSpc="1">
+                        <a:prstTxWarp prst="textNoShape">
+                          <a:avLst/>
+                        </a:prstTxWarp>
+                        <a:noAutofit/>
+                      </wps:bodyPr>
+                    </wps:wsp>
+                  </a:graphicData>
+                </a:graphic>
+                <wp14:sizeRelH relativeFrom="margin">
+                  <wp14:pctWidth>0</wp14:pctWidth>
+                </wp14:sizeRelH>
+                <wp14:sizeRelV relativeFrom="margin">
+                  <wp14:pctHeight>0</wp14:pctHeight>
+                </wp14:sizeRelV>
+              </wp:anchor>
+            </w:drawing>
+          </mc:Choice>
+          <mc:Fallback>
+            <w:pict>
+              <v:shape w14:anchorId="01B47914" id="_x0000_s1031" type="#_x0000_t202" style="position:absolute;margin-left:155.35pt;margin-top:17.4pt;width:89pt;height:52.15pt;z-index:251679744;visibility:visible;mso-wrap-style:square;mso-width-percent:0;mso-height-percent:0;mso-wrap-distance-left:9pt;mso-wrap-distance-top:0;mso-wrap-distance-right:9pt;mso-wrap-distance-bottom:0;mso-position-horizontal:absolute;mso-position-horizontal-relative:text;mso-position-vertical:absolute;mso-position-vertical-relative:text;mso-width-percent:0;mso-height-percent:0;mso-width-relative:margin;mso-height-relative:margin;v-text-anchor:top" o:gfxdata="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" fillcolor="white [3201]" strokeweight=".5pt">
+                <v:textbox>
+                  <w:txbxContent>
+                    <w:p>
+                      <w:r>
+                        <w:t>s3 silver -</w:t>
+                      </w:r>
+                      <w:r>
+                        <w:t xml:space="preserve">deduplication by </w:t>
+                      </w:r>
+                      <w:r>
+                        <w:t xml:space="preserve">event_id </w:t>
+                      </w:r>
+                    </w:p>
+                  </w:txbxContent>
+                </v:textbox>
+              </v:shape>
+            </w:pict>
+          </mc:Fallback>
+        </mc:AlternateContent>
+      </w:r>
       <w:r>
         <w:rPr>
           <w:noProof/>
@@ -8006,7 +8028,7 @@
                         <w:txbxContent>
                           <w:p>
                             <w:r>
-                              <w:t>aggregation</w:t>
+                              <w:t>Gold iceberg</w:t>
                             </w:r>
                           </w:p>
                         </w:txbxContent>
@@ -8036,7 +8058,7 @@
                   <w:txbxContent>
                     <w:p>
                       <w:r>
-                        <w:t>aggregation</w:t>
+                        <w:t>Gold iceberg</w:t>
                       </w:r>
                     </w:p>
                   </w:txbxContent>
@@ -8091,11 +8113,9 @@
                       <wps:txbx>
                         <w:txbxContent>
                           <w:p>
-                            <w:proofErr w:type="spellStart"/>
                             <w:r>
                               <w:t>quicksight</w:t>
                             </w:r>
-                            <w:proofErr w:type="spellEnd"/>
                           </w:p>
                         </w:txbxContent>
                       </wps:txbx>
@@ -8120,11 +8140,9 @@
                 <v:textbox>
                   <w:txbxContent>
                     <w:p>
-                      <w:proofErr w:type="spellStart"/>
                       <w:r>
                         <w:t>quicksight</w:t>
                       </w:r>
-                      <w:proofErr w:type="spellEnd"/>
                     </w:p>
                   </w:txbxContent>
                 </v:textbox>
@@ -8133,6 +8151,27 @@
           </mc:Fallback>
         </mc:AlternateContent>
       </w:r>
+      <w:proofErr w:type="spellStart"/>
+      <w:r>
+        <w:t>window_</w:t>
+      </w:r>
+      <w:proofErr w:type="gramStart"/>
+      <w:r>
+        <w:t>start,geography</w:t>
+      </w:r>
+      <w:proofErr w:type="gramEnd"/>
+      <w:r>
+        <w:t>,</w:t>
+      </w:r>
+      <w:proofErr w:type="gramStart"/>
+      <w:r>
+        <w:t>segment,event</w:t>
+      </w:r>
+      <w:proofErr w:type="gramEnd"/>
+      <w:r>
+        <w:t>_type</w:t>
+      </w:r>
+      <w:proofErr w:type="spellEnd"/>
       <w:r>
         <w:br w:type="page"/>
       </w:r>
@@ -8145,16 +8184,53 @@
       </w:pPr>
       <w:r>
         <w:lastRenderedPageBreak/>
-        <w:t xml:space="preserve">E1 failure – why replaying E1 </w:t>
+        <w:t>Kafka</w:t>
+      </w:r>
+    </w:p>
+    <w:p>
+      <w:pPr>
+        <w:tabs>
+          <w:tab w:val="left" w:pos="5737"/>
+        </w:tabs>
+      </w:pPr>
+      <w:r>
+        <w:t xml:space="preserve">  ↓</w:t>
+      </w:r>
+    </w:p>
+    <w:p>
+      <w:pPr>
+        <w:tabs>
+          <w:tab w:val="left" w:pos="5737"/>
+        </w:tabs>
+      </w:pPr>
+      <w:r>
+        <w:t>Spark ingestion job + checkpoint</w:t>
+      </w:r>
+    </w:p>
+    <w:p>
+      <w:pPr>
+        <w:tabs>
+          <w:tab w:val="left" w:pos="5737"/>
+        </w:tabs>
+      </w:pPr>
+      <w:r>
+        <w:t xml:space="preserve">  ↓</w:t>
+      </w:r>
+    </w:p>
+    <w:p>
+      <w:pPr>
+        <w:tabs>
+          <w:tab w:val="left" w:pos="5737"/>
+        </w:tabs>
+      </w:pPr>
+      <w:r>
+        <w:t xml:space="preserve">Bronze S3 — raw, append-only, </w:t>
       </w:r>
       <w:proofErr w:type="spellStart"/>
       <w:r>
-        <w:t>dosen’t</w:t>
+        <w:t>replayable</w:t>
       </w:r>
       <w:proofErr w:type="spellEnd"/>
-      <w:r>
-        <w:t xml:space="preserve"> create duplicate </w:t>
-      </w:r>
     </w:p>
     <w:p>
       <w:pPr>
@@ -8162,6 +8238,9 @@
           <w:tab w:val="left" w:pos="5737"/>
         </w:tabs>
       </w:pPr>
+      <w:r>
+        <w:t xml:space="preserve">  ↓</w:t>
+      </w:r>
     </w:p>
     <w:p>
       <w:pPr>
@@ -8169,6 +8248,9 @@
           <w:tab w:val="left" w:pos="5737"/>
         </w:tabs>
       </w:pPr>
+      <w:r>
+        <w:t>Spark validation/deduplication job + checkpoint</w:t>
+      </w:r>
     </w:p>
     <w:p>
       <w:pPr>
@@ -8177,76 +8259,1783 @@
         </w:tabs>
       </w:pPr>
       <w:r>
-        <w:t xml:space="preserve">Replaying from the offset </w:t>
+        <w:t xml:space="preserve">  ↓</w:t>
+      </w:r>
+    </w:p>
+    <w:p>
+      <w:pPr>
+        <w:tabs>
+          <w:tab w:val="left" w:pos="5737"/>
+        </w:tabs>
+      </w:pPr>
+      <w:r>
+        <w:t xml:space="preserve">Silver Iceberg — unique by </w:t>
       </w:r>
       <w:proofErr w:type="spellStart"/>
       <w:r>
-        <w:t>kafka</w:t>
+        <w:t>event_id</w:t>
       </w:r>
       <w:proofErr w:type="spellEnd"/>
-      <w:r>
-        <w:t xml:space="preserve"> reprocess the E1 and populates the raw s3 bronze but job spark ensures silver is duplicated using </w:t>
-      </w:r>
+    </w:p>
+    <w:p>
+      <w:pPr>
+        <w:tabs>
+          <w:tab w:val="left" w:pos="5737"/>
+        </w:tabs>
+      </w:pPr>
+      <w:r>
+        <w:t xml:space="preserve">  ↓</w:t>
+      </w:r>
+    </w:p>
+    <w:p>
+      <w:pPr>
+        <w:tabs>
+          <w:tab w:val="left" w:pos="5737"/>
+        </w:tabs>
+      </w:pPr>
+      <w:r>
+        <w:t>Spark window-aggregation job + checkpoint</w:t>
+      </w:r>
+    </w:p>
+    <w:p>
+      <w:pPr>
+        <w:tabs>
+          <w:tab w:val="left" w:pos="5737"/>
+        </w:tabs>
+      </w:pPr>
+      <w:r>
+        <w:t xml:space="preserve">  ↓</w:t>
+      </w:r>
+    </w:p>
+    <w:p>
+      <w:pPr>
+        <w:tabs>
+          <w:tab w:val="left" w:pos="5737"/>
+        </w:tabs>
+      </w:pPr>
+      <w:r>
+        <w:t>Gold Iceberg — five-minute aggregates</w:t>
+      </w:r>
+    </w:p>
+    <w:p>
+      <w:pPr>
+        <w:tabs>
+          <w:tab w:val="left" w:pos="5737"/>
+        </w:tabs>
+      </w:pPr>
+      <w:r>
+        <w:t xml:space="preserve">  ↓</w:t>
+      </w:r>
+    </w:p>
+    <w:p>
+      <w:pPr>
+        <w:tabs>
+          <w:tab w:val="left" w:pos="5737"/>
+        </w:tabs>
+      </w:pPr>
+      <w:r>
+        <w:t>Athena</w:t>
+      </w:r>
+    </w:p>
+    <w:p>
+      <w:pPr>
+        <w:tabs>
+          <w:tab w:val="left" w:pos="5737"/>
+        </w:tabs>
+      </w:pPr>
+      <w:r>
+        <w:t xml:space="preserve">  ↓</w:t>
+      </w:r>
+    </w:p>
+    <w:p>
+      <w:pPr>
+        <w:tabs>
+          <w:tab w:val="left" w:pos="5737"/>
+        </w:tabs>
+      </w:pPr>
       <w:proofErr w:type="spellStart"/>
       <w:r>
+        <w:t>QuickSight</w:t>
+      </w:r>
+      <w:proofErr w:type="spellEnd"/>
+    </w:p>
+    <w:p>
+      <w:pPr>
+        <w:tabs>
+          <w:tab w:val="left" w:pos="5737"/>
+        </w:tabs>
+      </w:pPr>
+    </w:p>
+    <w:p>
+      <w:proofErr w:type="gramStart"/>
+      <w:r>
+        <w:rPr>
+          <w:rFonts w:hAnsi="Symbol"/>
+        </w:rPr>
+        <w:t></w:t>
+      </w:r>
+      <w:r>
+        <w:t xml:space="preserve">  “</w:t>
+      </w:r>
+      <w:proofErr w:type="gramEnd"/>
+      <w:r>
+        <w:t xml:space="preserve">Spark ensures Silver is </w:t>
+      </w:r>
+      <w:r>
+        <w:rPr>
+          <w:rStyle w:val="Strong"/>
+        </w:rPr>
+        <w:t>deduplicated</w:t>
+      </w:r>
+      <w:r>
+        <w:t>,” not duplicated.</w:t>
+      </w:r>
+    </w:p>
+    <w:p>
+      <w:pPr>
+        <w:tabs>
+          <w:tab w:val="left" w:pos="5737"/>
+        </w:tabs>
+      </w:pPr>
+      <w:proofErr w:type="gramStart"/>
+      <w:r>
+        <w:rPr>
+          <w:rFonts w:hAnsi="Symbol"/>
+        </w:rPr>
+        <w:t></w:t>
+      </w:r>
+      <w:r>
+        <w:t xml:space="preserve">  The</w:t>
+      </w:r>
+      <w:proofErr w:type="gramEnd"/>
+      <w:r>
+        <w:t xml:space="preserve"> watermark is based on the </w:t>
+      </w:r>
+      <w:r>
+        <w:rPr>
+          <w:rStyle w:val="Strong"/>
+        </w:rPr>
+        <w:t>maximum observed event time</w:t>
+      </w:r>
+      <w:r>
+        <w:t>, not the wall-clock arrival time.</w:t>
+      </w:r>
+    </w:p>
+    <w:p>
+      <w:pPr>
+        <w:tabs>
+          <w:tab w:val="left" w:pos="5737"/>
+        </w:tabs>
+      </w:pPr>
+    </w:p>
+    <w:p>
+      <w:pPr>
+        <w:tabs>
+          <w:tab w:val="left" w:pos="5737"/>
+        </w:tabs>
+      </w:pPr>
+      <w:r>
+        <w:t xml:space="preserve">E1 may be replayed because spark crashed before checkpointing in progress. The ingestion job may consequently append E1 to Bronze again. This is safe because the silver iceberg table uses an idempotent MERGE keyed by </w:t>
+      </w:r>
+      <w:proofErr w:type="spellStart"/>
+      <w:r>
+        <w:t>event_</w:t>
+      </w:r>
+      <w:proofErr w:type="gramStart"/>
+      <w:r>
+        <w:t>id</w:t>
+      </w:r>
+      <w:proofErr w:type="spellEnd"/>
+      <w:r>
+        <w:t xml:space="preserve"> </w:t>
+      </w:r>
+      <w:r>
+        <w:t>.</w:t>
+      </w:r>
+      <w:proofErr w:type="gramEnd"/>
+      <w:r>
+        <w:t xml:space="preserve"> Since E1 already </w:t>
+      </w:r>
+      <w:proofErr w:type="spellStart"/>
+      <w:r>
+        <w:t>exisits</w:t>
+      </w:r>
+      <w:proofErr w:type="spellEnd"/>
+      <w:r>
+        <w:t xml:space="preserve">, the replay does not create another </w:t>
+      </w:r>
+      <w:proofErr w:type="gramStart"/>
+      <w:r>
+        <w:t>Silver</w:t>
+      </w:r>
+      <w:proofErr w:type="gramEnd"/>
+      <w:r>
+        <w:t xml:space="preserve"> row and therefore does not inflate the </w:t>
+      </w:r>
+      <w:proofErr w:type="gramStart"/>
+      <w:r>
+        <w:t>Gold</w:t>
+      </w:r>
+      <w:proofErr w:type="gramEnd"/>
+      <w:r>
+        <w:t xml:space="preserve"> aggregate.</w:t>
+      </w:r>
+    </w:p>
+    <w:p>
+      <w:pPr>
+        <w:tabs>
+          <w:tab w:val="left" w:pos="5737"/>
+        </w:tabs>
+      </w:pPr>
+    </w:p>
+    <w:p>
+      <w:pPr>
+        <w:tabs>
+          <w:tab w:val="left" w:pos="5737"/>
+        </w:tabs>
+      </w:pPr>
+      <w:r>
+        <w:t xml:space="preserve">E2 arrives at 10:20 but has event time of 10:02. Assuming the maximum observed event time is </w:t>
+      </w:r>
+      <w:proofErr w:type="gramStart"/>
+      <w:r>
+        <w:t>10:20 ,</w:t>
+      </w:r>
+      <w:proofErr w:type="gramEnd"/>
+      <w:r>
+        <w:t xml:space="preserve"> a 30-min watermark is at 09:50. Because E2’s event time is newer than the watermark, Spark accepts it and assign it to the 10:00-10:05 window. Spark recomputes that window and </w:t>
+      </w:r>
+      <w:proofErr w:type="spellStart"/>
+      <w:r>
+        <w:t>upserts</w:t>
+      </w:r>
+      <w:proofErr w:type="spellEnd"/>
+      <w:r>
+        <w:t xml:space="preserve"> the absolute count of 2 into Gold. Retrying the </w:t>
+      </w:r>
+      <w:proofErr w:type="spellStart"/>
+      <w:r>
         <w:t>upsert</w:t>
       </w:r>
       <w:proofErr w:type="spellEnd"/>
       <w:r>
+        <w:t xml:space="preserve"> still writes 2, so it remains idempotent.</w:t>
+      </w:r>
+    </w:p>
+    <w:p>
+      <w:pPr>
+        <w:tabs>
+          <w:tab w:val="left" w:pos="5737"/>
+        </w:tabs>
+      </w:pPr>
+    </w:p>
+    <w:p>
+      <w:pPr>
+        <w:tabs>
+          <w:tab w:val="left" w:pos="5737"/>
+        </w:tabs>
+      </w:pPr>
+    </w:p>
+    <w:p>
+      <w:pPr>
+        <w:spacing w:before="100" w:beforeAutospacing="1" w:after="100" w:afterAutospacing="1"/>
+      </w:pPr>
+      <w:r>
+        <w:t xml:space="preserve">The key distinction </w:t>
+      </w:r>
+      <w:proofErr w:type="gramStart"/>
+      <w:r>
+        <w:t>is:</w:t>
+      </w:r>
+      <w:proofErr w:type="gramEnd"/>
+      <w:r>
         <w:t xml:space="preserve"> </w:t>
       </w:r>
-    </w:p>
-    <w:p>
-      <w:pPr>
-        <w:spacing w:after="160" w:line="278" w:lineRule="auto"/>
-      </w:pPr>
-      <w:r>
-        <w:t xml:space="preserve">E2 how watermark with 30 min allow E2 to be part of </w:t>
-      </w:r>
-      <w:r>
-        <w:br/>
-        <w:t xml:space="preserve">E2 arrives at 10:20 with </w:t>
-      </w:r>
+      <w:r>
+        <w:rPr>
+          <w:b/>
+          <w:bCs/>
+        </w:rPr>
+        <w:t>Gold does not store E1 and E2 as separate event rows.</w:t>
+      </w:r>
+      <w:r>
+        <w:t xml:space="preserve"> Gold stores one aggregate row representing their shared window.</w:t>
+      </w:r>
+    </w:p>
+    <w:p>
+      <w:pPr>
+        <w:spacing w:before="100" w:beforeAutospacing="1" w:after="100" w:afterAutospacing="1"/>
+      </w:pPr>
+      <w:r>
+        <w:t>E1 replay and E2’s late arrival are also two separate situations.</w:t>
+      </w:r>
+    </w:p>
+    <w:p>
+      <w:pPr>
+        <w:tabs>
+          <w:tab w:val="left" w:pos="916"/>
+          <w:tab w:val="left" w:pos="1832"/>
+          <w:tab w:val="left" w:pos="2748"/>
+          <w:tab w:val="left" w:pos="3664"/>
+          <w:tab w:val="left" w:pos="4580"/>
+          <w:tab w:val="left" w:pos="5496"/>
+          <w:tab w:val="left" w:pos="6412"/>
+          <w:tab w:val="left" w:pos="7328"/>
+          <w:tab w:val="left" w:pos="8244"/>
+          <w:tab w:val="left" w:pos="9160"/>
+          <w:tab w:val="left" w:pos="10076"/>
+          <w:tab w:val="left" w:pos="10992"/>
+          <w:tab w:val="left" w:pos="11908"/>
+          <w:tab w:val="left" w:pos="12824"/>
+          <w:tab w:val="left" w:pos="13740"/>
+          <w:tab w:val="left" w:pos="14656"/>
+        </w:tabs>
+        <w:rPr>
+          <w:rFonts w:ascii="Courier New" w:hAnsi="Courier New" w:cs="Courier New"/>
+          <w:sz w:val="20"/>
+          <w:szCs w:val="20"/>
+        </w:rPr>
+      </w:pPr>
+      <w:r>
+        <w:rPr>
+          <w:rFonts w:ascii="Courier New" w:hAnsi="Courier New" w:cs="Courier New"/>
+          <w:sz w:val="20"/>
+          <w:szCs w:val="20"/>
+        </w:rPr>
+        <w:t>Silver event table</w:t>
+      </w:r>
+    </w:p>
+    <w:p>
+      <w:pPr>
+        <w:tabs>
+          <w:tab w:val="left" w:pos="916"/>
+          <w:tab w:val="left" w:pos="1832"/>
+          <w:tab w:val="left" w:pos="2748"/>
+          <w:tab w:val="left" w:pos="3664"/>
+          <w:tab w:val="left" w:pos="4580"/>
+          <w:tab w:val="left" w:pos="5496"/>
+          <w:tab w:val="left" w:pos="6412"/>
+          <w:tab w:val="left" w:pos="7328"/>
+          <w:tab w:val="left" w:pos="8244"/>
+          <w:tab w:val="left" w:pos="9160"/>
+          <w:tab w:val="left" w:pos="10076"/>
+          <w:tab w:val="left" w:pos="10992"/>
+          <w:tab w:val="left" w:pos="11908"/>
+          <w:tab w:val="left" w:pos="12824"/>
+          <w:tab w:val="left" w:pos="13740"/>
+          <w:tab w:val="left" w:pos="14656"/>
+        </w:tabs>
+        <w:rPr>
+          <w:rFonts w:ascii="Courier New" w:hAnsi="Courier New" w:cs="Courier New"/>
+          <w:sz w:val="20"/>
+          <w:szCs w:val="20"/>
+        </w:rPr>
+      </w:pPr>
       <w:proofErr w:type="spellStart"/>
       <w:r>
+        <w:rPr>
+          <w:rFonts w:ascii="Courier New" w:hAnsi="Courier New" w:cs="Courier New"/>
+          <w:sz w:val="20"/>
+          <w:szCs w:val="20"/>
+        </w:rPr>
+        <w:t>event_id</w:t>
+      </w:r>
+      <w:proofErr w:type="spellEnd"/>
+      <w:r>
+        <w:rPr>
+          <w:rFonts w:ascii="Courier New" w:hAnsi="Courier New" w:cs="Courier New"/>
+          <w:sz w:val="20"/>
+          <w:szCs w:val="20"/>
+        </w:rPr>
+        <w:t xml:space="preserve"> | </w:t>
+      </w:r>
+      <w:proofErr w:type="spellStart"/>
+      <w:r>
+        <w:rPr>
+          <w:rFonts w:ascii="Courier New" w:hAnsi="Courier New" w:cs="Courier New"/>
+          <w:sz w:val="20"/>
+          <w:szCs w:val="20"/>
+        </w:rPr>
         <w:t>event_time</w:t>
       </w:r>
       <w:proofErr w:type="spellEnd"/>
-      <w:r>
-        <w:t xml:space="preserve"> as 10:02 with watermark 30 min </w:t>
-      </w:r>
+    </w:p>
+    <w:p>
+      <w:pPr>
+        <w:tabs>
+          <w:tab w:val="left" w:pos="916"/>
+          <w:tab w:val="left" w:pos="1832"/>
+          <w:tab w:val="left" w:pos="2748"/>
+          <w:tab w:val="left" w:pos="3664"/>
+          <w:tab w:val="left" w:pos="4580"/>
+          <w:tab w:val="left" w:pos="5496"/>
+          <w:tab w:val="left" w:pos="6412"/>
+          <w:tab w:val="left" w:pos="7328"/>
+          <w:tab w:val="left" w:pos="8244"/>
+          <w:tab w:val="left" w:pos="9160"/>
+          <w:tab w:val="left" w:pos="10076"/>
+          <w:tab w:val="left" w:pos="10992"/>
+          <w:tab w:val="left" w:pos="11908"/>
+          <w:tab w:val="left" w:pos="12824"/>
+          <w:tab w:val="left" w:pos="13740"/>
+          <w:tab w:val="left" w:pos="14656"/>
+        </w:tabs>
+        <w:rPr>
+          <w:rFonts w:ascii="Courier New" w:hAnsi="Courier New" w:cs="Courier New"/>
+          <w:sz w:val="20"/>
+          <w:szCs w:val="20"/>
+        </w:rPr>
+      </w:pPr>
+      <w:r>
+        <w:rPr>
+          <w:rFonts w:ascii="Courier New" w:hAnsi="Courier New" w:cs="Courier New"/>
+          <w:sz w:val="20"/>
+          <w:szCs w:val="20"/>
+        </w:rPr>
+        <w:t>E1       | 10:00</w:t>
+      </w:r>
+    </w:p>
+    <w:p>
+      <w:pPr>
+        <w:tabs>
+          <w:tab w:val="left" w:pos="916"/>
+          <w:tab w:val="left" w:pos="1832"/>
+          <w:tab w:val="left" w:pos="2748"/>
+          <w:tab w:val="left" w:pos="3664"/>
+          <w:tab w:val="left" w:pos="4580"/>
+          <w:tab w:val="left" w:pos="5496"/>
+          <w:tab w:val="left" w:pos="6412"/>
+          <w:tab w:val="left" w:pos="7328"/>
+          <w:tab w:val="left" w:pos="8244"/>
+          <w:tab w:val="left" w:pos="9160"/>
+          <w:tab w:val="left" w:pos="10076"/>
+          <w:tab w:val="left" w:pos="10992"/>
+          <w:tab w:val="left" w:pos="11908"/>
+          <w:tab w:val="left" w:pos="12824"/>
+          <w:tab w:val="left" w:pos="13740"/>
+          <w:tab w:val="left" w:pos="14656"/>
+        </w:tabs>
+        <w:rPr>
+          <w:rFonts w:ascii="Courier New" w:hAnsi="Courier New" w:cs="Courier New"/>
+          <w:sz w:val="20"/>
+          <w:szCs w:val="20"/>
+        </w:rPr>
+      </w:pPr>
+      <w:r>
+        <w:rPr>
+          <w:rFonts w:ascii="Courier New" w:hAnsi="Courier New" w:cs="Courier New"/>
+          <w:sz w:val="20"/>
+          <w:szCs w:val="20"/>
+        </w:rPr>
+        <w:t>E2       | 10:02</w:t>
+      </w:r>
+    </w:p>
+    <w:p>
+      <w:pPr>
+        <w:spacing w:before="100" w:beforeAutospacing="1" w:after="100" w:afterAutospacing="1"/>
+      </w:pPr>
+      <w:r>
+        <w:t>Both events belong to the same five-minute window:</w:t>
+      </w:r>
+    </w:p>
+    <w:p>
+      <w:pPr>
+        <w:tabs>
+          <w:tab w:val="left" w:pos="916"/>
+          <w:tab w:val="left" w:pos="1832"/>
+          <w:tab w:val="left" w:pos="2748"/>
+          <w:tab w:val="left" w:pos="3664"/>
+          <w:tab w:val="left" w:pos="4580"/>
+          <w:tab w:val="left" w:pos="5496"/>
+          <w:tab w:val="left" w:pos="6412"/>
+          <w:tab w:val="left" w:pos="7328"/>
+          <w:tab w:val="left" w:pos="8244"/>
+          <w:tab w:val="left" w:pos="9160"/>
+          <w:tab w:val="left" w:pos="10076"/>
+          <w:tab w:val="left" w:pos="10992"/>
+          <w:tab w:val="left" w:pos="11908"/>
+          <w:tab w:val="left" w:pos="12824"/>
+          <w:tab w:val="left" w:pos="13740"/>
+          <w:tab w:val="left" w:pos="14656"/>
+        </w:tabs>
+        <w:rPr>
+          <w:rFonts w:ascii="Courier New" w:hAnsi="Courier New" w:cs="Courier New"/>
+          <w:sz w:val="20"/>
+          <w:szCs w:val="20"/>
+        </w:rPr>
+      </w:pPr>
+      <w:r>
+        <w:rPr>
+          <w:rFonts w:ascii="Courier New" w:hAnsi="Courier New" w:cs="Courier New"/>
+          <w:sz w:val="20"/>
+          <w:szCs w:val="20"/>
+        </w:rPr>
+        <w:lastRenderedPageBreak/>
+        <w:t xml:space="preserve">10:00 ≤ </w:t>
+      </w:r>
+      <w:proofErr w:type="spellStart"/>
+      <w:r>
+        <w:rPr>
+          <w:rFonts w:ascii="Courier New" w:hAnsi="Courier New" w:cs="Courier New"/>
+          <w:sz w:val="20"/>
+          <w:szCs w:val="20"/>
+        </w:rPr>
+        <w:t>event_time</w:t>
+      </w:r>
+      <w:proofErr w:type="spellEnd"/>
+      <w:r>
+        <w:rPr>
+          <w:rFonts w:ascii="Courier New" w:hAnsi="Courier New" w:cs="Courier New"/>
+          <w:sz w:val="20"/>
+          <w:szCs w:val="20"/>
+        </w:rPr>
+        <w:t xml:space="preserve"> &lt; 10:05</w:t>
+      </w:r>
+    </w:p>
+    <w:p>
+      <w:pPr>
+        <w:spacing w:before="100" w:beforeAutospacing="1" w:after="100" w:afterAutospacing="1"/>
+      </w:pPr>
       <w:proofErr w:type="gramStart"/>
       <w:r>
-        <w:t>9:50 ,</w:t>
+        <w:t>Therefore</w:t>
       </w:r>
       <w:proofErr w:type="gramEnd"/>
       <w:r>
-        <w:t xml:space="preserve"> spark reads the </w:t>
-      </w:r>
+        <w:t xml:space="preserve"> Gold should contain:</w:t>
+      </w:r>
+    </w:p>
+    <w:p>
+      <w:pPr>
+        <w:tabs>
+          <w:tab w:val="left" w:pos="916"/>
+          <w:tab w:val="left" w:pos="1832"/>
+          <w:tab w:val="left" w:pos="2748"/>
+          <w:tab w:val="left" w:pos="3664"/>
+          <w:tab w:val="left" w:pos="4580"/>
+          <w:tab w:val="left" w:pos="5496"/>
+          <w:tab w:val="left" w:pos="6412"/>
+          <w:tab w:val="left" w:pos="7328"/>
+          <w:tab w:val="left" w:pos="8244"/>
+          <w:tab w:val="left" w:pos="9160"/>
+          <w:tab w:val="left" w:pos="10076"/>
+          <w:tab w:val="left" w:pos="10992"/>
+          <w:tab w:val="left" w:pos="11908"/>
+          <w:tab w:val="left" w:pos="12824"/>
+          <w:tab w:val="left" w:pos="13740"/>
+          <w:tab w:val="left" w:pos="14656"/>
+        </w:tabs>
+        <w:rPr>
+          <w:rFonts w:ascii="Courier New" w:hAnsi="Courier New" w:cs="Courier New"/>
+          <w:sz w:val="20"/>
+          <w:szCs w:val="20"/>
+        </w:rPr>
+      </w:pPr>
+      <w:r>
+        <w:rPr>
+          <w:rFonts w:ascii="Courier New" w:hAnsi="Courier New" w:cs="Courier New"/>
+          <w:sz w:val="20"/>
+          <w:szCs w:val="20"/>
+        </w:rPr>
+        <w:t>Gold aggregate table</w:t>
+      </w:r>
+    </w:p>
+    <w:p>
+      <w:pPr>
+        <w:tabs>
+          <w:tab w:val="left" w:pos="916"/>
+          <w:tab w:val="left" w:pos="1832"/>
+          <w:tab w:val="left" w:pos="2748"/>
+          <w:tab w:val="left" w:pos="3664"/>
+          <w:tab w:val="left" w:pos="4580"/>
+          <w:tab w:val="left" w:pos="5496"/>
+          <w:tab w:val="left" w:pos="6412"/>
+          <w:tab w:val="left" w:pos="7328"/>
+          <w:tab w:val="left" w:pos="8244"/>
+          <w:tab w:val="left" w:pos="9160"/>
+          <w:tab w:val="left" w:pos="10076"/>
+          <w:tab w:val="left" w:pos="10992"/>
+          <w:tab w:val="left" w:pos="11908"/>
+          <w:tab w:val="left" w:pos="12824"/>
+          <w:tab w:val="left" w:pos="13740"/>
+          <w:tab w:val="left" w:pos="14656"/>
+        </w:tabs>
+        <w:rPr>
+          <w:rFonts w:ascii="Courier New" w:hAnsi="Courier New" w:cs="Courier New"/>
+          <w:sz w:val="20"/>
+          <w:szCs w:val="20"/>
+        </w:rPr>
+      </w:pPr>
       <w:proofErr w:type="spellStart"/>
       <w:r>
+        <w:rPr>
+          <w:rFonts w:ascii="Courier New" w:hAnsi="Courier New" w:cs="Courier New"/>
+          <w:sz w:val="20"/>
+          <w:szCs w:val="20"/>
+        </w:rPr>
+        <w:t>window_start</w:t>
+      </w:r>
+      <w:proofErr w:type="spellEnd"/>
+      <w:r>
+        <w:rPr>
+          <w:rFonts w:ascii="Courier New" w:hAnsi="Courier New" w:cs="Courier New"/>
+          <w:sz w:val="20"/>
+          <w:szCs w:val="20"/>
+        </w:rPr>
+        <w:t xml:space="preserve"> | </w:t>
+      </w:r>
+      <w:proofErr w:type="spellStart"/>
+      <w:r>
+        <w:rPr>
+          <w:rFonts w:ascii="Courier New" w:hAnsi="Courier New" w:cs="Courier New"/>
+          <w:sz w:val="20"/>
+          <w:szCs w:val="20"/>
+        </w:rPr>
+        <w:t>event_count</w:t>
+      </w:r>
+      <w:proofErr w:type="spellEnd"/>
+    </w:p>
+    <w:p>
+      <w:pPr>
+        <w:tabs>
+          <w:tab w:val="left" w:pos="916"/>
+          <w:tab w:val="left" w:pos="1832"/>
+          <w:tab w:val="left" w:pos="2748"/>
+          <w:tab w:val="left" w:pos="3664"/>
+          <w:tab w:val="left" w:pos="4580"/>
+          <w:tab w:val="left" w:pos="5496"/>
+          <w:tab w:val="left" w:pos="6412"/>
+          <w:tab w:val="left" w:pos="7328"/>
+          <w:tab w:val="left" w:pos="8244"/>
+          <w:tab w:val="left" w:pos="9160"/>
+          <w:tab w:val="left" w:pos="10076"/>
+          <w:tab w:val="left" w:pos="10992"/>
+          <w:tab w:val="left" w:pos="11908"/>
+          <w:tab w:val="left" w:pos="12824"/>
+          <w:tab w:val="left" w:pos="13740"/>
+          <w:tab w:val="left" w:pos="14656"/>
+        </w:tabs>
+        <w:rPr>
+          <w:rFonts w:ascii="Courier New" w:hAnsi="Courier New" w:cs="Courier New"/>
+          <w:sz w:val="20"/>
+          <w:szCs w:val="20"/>
+        </w:rPr>
+      </w:pPr>
+      <w:r>
+        <w:rPr>
+          <w:rFonts w:ascii="Courier New" w:hAnsi="Courier New" w:cs="Courier New"/>
+          <w:sz w:val="20"/>
+          <w:szCs w:val="20"/>
+        </w:rPr>
+        <w:t>10:00        | 2</w:t>
+      </w:r>
+    </w:p>
+    <w:p>
+      <w:pPr>
+        <w:spacing w:before="100" w:beforeAutospacing="1" w:after="100" w:afterAutospacing="1"/>
+        <w:outlineLvl w:val="2"/>
+        <w:rPr>
+          <w:b/>
+          <w:bCs/>
+          <w:sz w:val="27"/>
+          <w:szCs w:val="27"/>
+        </w:rPr>
+      </w:pPr>
+      <w:r>
+        <w:rPr>
+          <w:b/>
+          <w:bCs/>
+          <w:sz w:val="27"/>
+          <w:szCs w:val="27"/>
+        </w:rPr>
+        <w:t>What happened chronologically</w:t>
+      </w:r>
+    </w:p>
+    <w:p>
+      <w:pPr>
+        <w:spacing w:before="100" w:beforeAutospacing="1" w:after="100" w:afterAutospacing="1"/>
+      </w:pPr>
+      <w:r>
+        <w:t>Before the failure:</w:t>
+      </w:r>
+    </w:p>
+    <w:p>
+      <w:pPr>
+        <w:tabs>
+          <w:tab w:val="left" w:pos="916"/>
+          <w:tab w:val="left" w:pos="1832"/>
+          <w:tab w:val="left" w:pos="2748"/>
+          <w:tab w:val="left" w:pos="3664"/>
+          <w:tab w:val="left" w:pos="4580"/>
+          <w:tab w:val="left" w:pos="5496"/>
+          <w:tab w:val="left" w:pos="6412"/>
+          <w:tab w:val="left" w:pos="7328"/>
+          <w:tab w:val="left" w:pos="8244"/>
+          <w:tab w:val="left" w:pos="9160"/>
+          <w:tab w:val="left" w:pos="10076"/>
+          <w:tab w:val="left" w:pos="10992"/>
+          <w:tab w:val="left" w:pos="11908"/>
+          <w:tab w:val="left" w:pos="12824"/>
+          <w:tab w:val="left" w:pos="13740"/>
+          <w:tab w:val="left" w:pos="14656"/>
+        </w:tabs>
+        <w:rPr>
+          <w:rFonts w:ascii="Courier New" w:hAnsi="Courier New" w:cs="Courier New"/>
+          <w:sz w:val="20"/>
+          <w:szCs w:val="20"/>
+        </w:rPr>
+      </w:pPr>
+      <w:r>
+        <w:rPr>
+          <w:rFonts w:ascii="Courier New" w:hAnsi="Courier New" w:cs="Courier New"/>
+          <w:sz w:val="20"/>
+          <w:szCs w:val="20"/>
+        </w:rPr>
+        <w:t>Silver: E1</w:t>
+      </w:r>
+    </w:p>
+    <w:p>
+      <w:pPr>
+        <w:tabs>
+          <w:tab w:val="left" w:pos="916"/>
+          <w:tab w:val="left" w:pos="1832"/>
+          <w:tab w:val="left" w:pos="2748"/>
+          <w:tab w:val="left" w:pos="3664"/>
+          <w:tab w:val="left" w:pos="4580"/>
+          <w:tab w:val="left" w:pos="5496"/>
+          <w:tab w:val="left" w:pos="6412"/>
+          <w:tab w:val="left" w:pos="7328"/>
+          <w:tab w:val="left" w:pos="8244"/>
+          <w:tab w:val="left" w:pos="9160"/>
+          <w:tab w:val="left" w:pos="10076"/>
+          <w:tab w:val="left" w:pos="10992"/>
+          <w:tab w:val="left" w:pos="11908"/>
+          <w:tab w:val="left" w:pos="12824"/>
+          <w:tab w:val="left" w:pos="13740"/>
+          <w:tab w:val="left" w:pos="14656"/>
+        </w:tabs>
+        <w:rPr>
+          <w:rFonts w:ascii="Courier New" w:hAnsi="Courier New" w:cs="Courier New"/>
+          <w:sz w:val="20"/>
+          <w:szCs w:val="20"/>
+        </w:rPr>
+      </w:pPr>
+      <w:r>
+        <w:rPr>
+          <w:rFonts w:ascii="Courier New" w:hAnsi="Courier New" w:cs="Courier New"/>
+          <w:sz w:val="20"/>
+          <w:szCs w:val="20"/>
+        </w:rPr>
+        <w:t>Gold 10:00 window: count = 1</w:t>
+      </w:r>
+    </w:p>
+    <w:p>
+      <w:pPr>
+        <w:spacing w:before="100" w:beforeAutospacing="1" w:after="100" w:afterAutospacing="1"/>
+      </w:pPr>
+      <w:r>
+        <w:t>After the failure, E1 may be replayed:</w:t>
+      </w:r>
+    </w:p>
+    <w:p>
+      <w:pPr>
+        <w:tabs>
+          <w:tab w:val="left" w:pos="916"/>
+          <w:tab w:val="left" w:pos="1832"/>
+          <w:tab w:val="left" w:pos="2748"/>
+          <w:tab w:val="left" w:pos="3664"/>
+          <w:tab w:val="left" w:pos="4580"/>
+          <w:tab w:val="left" w:pos="5496"/>
+          <w:tab w:val="left" w:pos="6412"/>
+          <w:tab w:val="left" w:pos="7328"/>
+          <w:tab w:val="left" w:pos="8244"/>
+          <w:tab w:val="left" w:pos="9160"/>
+          <w:tab w:val="left" w:pos="10076"/>
+          <w:tab w:val="left" w:pos="10992"/>
+          <w:tab w:val="left" w:pos="11908"/>
+          <w:tab w:val="left" w:pos="12824"/>
+          <w:tab w:val="left" w:pos="13740"/>
+          <w:tab w:val="left" w:pos="14656"/>
+        </w:tabs>
+        <w:rPr>
+          <w:rFonts w:ascii="Courier New" w:hAnsi="Courier New" w:cs="Courier New"/>
+          <w:sz w:val="20"/>
+          <w:szCs w:val="20"/>
+        </w:rPr>
+      </w:pPr>
+      <w:r>
+        <w:rPr>
+          <w:rFonts w:ascii="Courier New" w:hAnsi="Courier New" w:cs="Courier New"/>
+          <w:sz w:val="20"/>
+          <w:szCs w:val="20"/>
+        </w:rPr>
+        <w:t>Bronze: may receive another E1</w:t>
+      </w:r>
+    </w:p>
+    <w:p>
+      <w:pPr>
+        <w:tabs>
+          <w:tab w:val="left" w:pos="916"/>
+          <w:tab w:val="left" w:pos="1832"/>
+          <w:tab w:val="left" w:pos="2748"/>
+          <w:tab w:val="left" w:pos="3664"/>
+          <w:tab w:val="left" w:pos="4580"/>
+          <w:tab w:val="left" w:pos="5496"/>
+          <w:tab w:val="left" w:pos="6412"/>
+          <w:tab w:val="left" w:pos="7328"/>
+          <w:tab w:val="left" w:pos="8244"/>
+          <w:tab w:val="left" w:pos="9160"/>
+          <w:tab w:val="left" w:pos="10076"/>
+          <w:tab w:val="left" w:pos="10992"/>
+          <w:tab w:val="left" w:pos="11908"/>
+          <w:tab w:val="left" w:pos="12824"/>
+          <w:tab w:val="left" w:pos="13740"/>
+          <w:tab w:val="left" w:pos="14656"/>
+        </w:tabs>
+        <w:rPr>
+          <w:rFonts w:ascii="Courier New" w:hAnsi="Courier New" w:cs="Courier New"/>
+          <w:sz w:val="20"/>
+          <w:szCs w:val="20"/>
+        </w:rPr>
+      </w:pPr>
+      <w:r>
+        <w:rPr>
+          <w:rFonts w:ascii="Courier New" w:hAnsi="Courier New" w:cs="Courier New"/>
+          <w:sz w:val="20"/>
+          <w:szCs w:val="20"/>
+        </w:rPr>
+        <w:t xml:space="preserve">Silver: MERGE sees </w:t>
+      </w:r>
+      <w:proofErr w:type="spellStart"/>
+      <w:r>
+        <w:rPr>
+          <w:rFonts w:ascii="Courier New" w:hAnsi="Courier New" w:cs="Courier New"/>
+          <w:sz w:val="20"/>
+          <w:szCs w:val="20"/>
+        </w:rPr>
+        <w:t>event_id</w:t>
+      </w:r>
+      <w:proofErr w:type="spellEnd"/>
+      <w:r>
+        <w:rPr>
+          <w:rFonts w:ascii="Courier New" w:hAnsi="Courier New" w:cs="Courier New"/>
+          <w:sz w:val="20"/>
+          <w:szCs w:val="20"/>
+        </w:rPr>
+        <w:t xml:space="preserve"> E1 already exists</w:t>
+      </w:r>
+    </w:p>
+    <w:p>
+      <w:pPr>
+        <w:tabs>
+          <w:tab w:val="left" w:pos="916"/>
+          <w:tab w:val="left" w:pos="1832"/>
+          <w:tab w:val="left" w:pos="2748"/>
+          <w:tab w:val="left" w:pos="3664"/>
+          <w:tab w:val="left" w:pos="4580"/>
+          <w:tab w:val="left" w:pos="5496"/>
+          <w:tab w:val="left" w:pos="6412"/>
+          <w:tab w:val="left" w:pos="7328"/>
+          <w:tab w:val="left" w:pos="8244"/>
+          <w:tab w:val="left" w:pos="9160"/>
+          <w:tab w:val="left" w:pos="10076"/>
+          <w:tab w:val="left" w:pos="10992"/>
+          <w:tab w:val="left" w:pos="11908"/>
+          <w:tab w:val="left" w:pos="12824"/>
+          <w:tab w:val="left" w:pos="13740"/>
+          <w:tab w:val="left" w:pos="14656"/>
+        </w:tabs>
+        <w:rPr>
+          <w:rFonts w:ascii="Courier New" w:hAnsi="Courier New" w:cs="Courier New"/>
+          <w:sz w:val="20"/>
+          <w:szCs w:val="20"/>
+        </w:rPr>
+      </w:pPr>
+      <w:r>
+        <w:rPr>
+          <w:rFonts w:ascii="Courier New" w:hAnsi="Courier New" w:cs="Courier New"/>
+          <w:sz w:val="20"/>
+          <w:szCs w:val="20"/>
+        </w:rPr>
+        <w:t>Gold: remains count = 1</w:t>
+      </w:r>
+    </w:p>
+    <w:p>
+      <w:pPr>
+        <w:spacing w:before="100" w:beforeAutospacing="1" w:after="100" w:afterAutospacing="1"/>
+      </w:pPr>
+      <w:r>
+        <w:t>Later, E2 arrives. E2 is not a replay—it is a new event that arrived late:</w:t>
+      </w:r>
+    </w:p>
+    <w:p>
+      <w:pPr>
+        <w:tabs>
+          <w:tab w:val="left" w:pos="916"/>
+          <w:tab w:val="left" w:pos="1832"/>
+          <w:tab w:val="left" w:pos="2748"/>
+          <w:tab w:val="left" w:pos="3664"/>
+          <w:tab w:val="left" w:pos="4580"/>
+          <w:tab w:val="left" w:pos="5496"/>
+          <w:tab w:val="left" w:pos="6412"/>
+          <w:tab w:val="left" w:pos="7328"/>
+          <w:tab w:val="left" w:pos="8244"/>
+          <w:tab w:val="left" w:pos="9160"/>
+          <w:tab w:val="left" w:pos="10076"/>
+          <w:tab w:val="left" w:pos="10992"/>
+          <w:tab w:val="left" w:pos="11908"/>
+          <w:tab w:val="left" w:pos="12824"/>
+          <w:tab w:val="left" w:pos="13740"/>
+          <w:tab w:val="left" w:pos="14656"/>
+        </w:tabs>
+        <w:rPr>
+          <w:rFonts w:ascii="Courier New" w:hAnsi="Courier New" w:cs="Courier New"/>
+          <w:sz w:val="20"/>
+          <w:szCs w:val="20"/>
+        </w:rPr>
+      </w:pPr>
+      <w:r>
+        <w:rPr>
+          <w:rFonts w:ascii="Courier New" w:hAnsi="Courier New" w:cs="Courier New"/>
+          <w:sz w:val="20"/>
+          <w:szCs w:val="20"/>
+        </w:rPr>
+        <w:t>Bronze: appends E2</w:t>
+      </w:r>
+    </w:p>
+    <w:p>
+      <w:pPr>
+        <w:tabs>
+          <w:tab w:val="left" w:pos="916"/>
+          <w:tab w:val="left" w:pos="1832"/>
+          <w:tab w:val="left" w:pos="2748"/>
+          <w:tab w:val="left" w:pos="3664"/>
+          <w:tab w:val="left" w:pos="4580"/>
+          <w:tab w:val="left" w:pos="5496"/>
+          <w:tab w:val="left" w:pos="6412"/>
+          <w:tab w:val="left" w:pos="7328"/>
+          <w:tab w:val="left" w:pos="8244"/>
+          <w:tab w:val="left" w:pos="9160"/>
+          <w:tab w:val="left" w:pos="10076"/>
+          <w:tab w:val="left" w:pos="10992"/>
+          <w:tab w:val="left" w:pos="11908"/>
+          <w:tab w:val="left" w:pos="12824"/>
+          <w:tab w:val="left" w:pos="13740"/>
+          <w:tab w:val="left" w:pos="14656"/>
+        </w:tabs>
+        <w:rPr>
+          <w:rFonts w:ascii="Courier New" w:hAnsi="Courier New" w:cs="Courier New"/>
+          <w:sz w:val="20"/>
+          <w:szCs w:val="20"/>
+        </w:rPr>
+      </w:pPr>
+      <w:r>
+        <w:rPr>
+          <w:rFonts w:ascii="Courier New" w:hAnsi="Courier New" w:cs="Courier New"/>
+          <w:sz w:val="20"/>
+          <w:szCs w:val="20"/>
+        </w:rPr>
+        <w:t xml:space="preserve">Silver: inserts E2 because </w:t>
+      </w:r>
+      <w:proofErr w:type="spellStart"/>
+      <w:r>
+        <w:rPr>
+          <w:rFonts w:ascii="Courier New" w:hAnsi="Courier New" w:cs="Courier New"/>
+          <w:sz w:val="20"/>
+          <w:szCs w:val="20"/>
+        </w:rPr>
+        <w:t>event_id</w:t>
+      </w:r>
+      <w:proofErr w:type="spellEnd"/>
+      <w:r>
+        <w:rPr>
+          <w:rFonts w:ascii="Courier New" w:hAnsi="Courier New" w:cs="Courier New"/>
+          <w:sz w:val="20"/>
+          <w:szCs w:val="20"/>
+        </w:rPr>
+        <w:t xml:space="preserve"> E2 is new</w:t>
+      </w:r>
+    </w:p>
+    <w:p>
+      <w:pPr>
+        <w:tabs>
+          <w:tab w:val="left" w:pos="916"/>
+          <w:tab w:val="left" w:pos="1832"/>
+          <w:tab w:val="left" w:pos="2748"/>
+          <w:tab w:val="left" w:pos="3664"/>
+          <w:tab w:val="left" w:pos="4580"/>
+          <w:tab w:val="left" w:pos="5496"/>
+          <w:tab w:val="left" w:pos="6412"/>
+          <w:tab w:val="left" w:pos="7328"/>
+          <w:tab w:val="left" w:pos="8244"/>
+          <w:tab w:val="left" w:pos="9160"/>
+          <w:tab w:val="left" w:pos="10076"/>
+          <w:tab w:val="left" w:pos="10992"/>
+          <w:tab w:val="left" w:pos="11908"/>
+          <w:tab w:val="left" w:pos="12824"/>
+          <w:tab w:val="left" w:pos="13740"/>
+          <w:tab w:val="left" w:pos="14656"/>
+        </w:tabs>
+        <w:rPr>
+          <w:rFonts w:ascii="Courier New" w:hAnsi="Courier New" w:cs="Courier New"/>
+          <w:sz w:val="20"/>
+          <w:szCs w:val="20"/>
+        </w:rPr>
+      </w:pPr>
+      <w:r>
+        <w:rPr>
+          <w:rFonts w:ascii="Courier New" w:hAnsi="Courier New" w:cs="Courier New"/>
+          <w:sz w:val="20"/>
+          <w:szCs w:val="20"/>
+        </w:rPr>
+        <w:t>Gold: E1 + E2 = count 2</w:t>
+      </w:r>
+    </w:p>
+    <w:p>
+      <w:pPr>
+        <w:spacing w:before="100" w:beforeAutospacing="1" w:after="100" w:afterAutospacing="1"/>
+        <w:outlineLvl w:val="2"/>
+        <w:rPr>
+          <w:b/>
+          <w:bCs/>
+          <w:sz w:val="27"/>
+          <w:szCs w:val="27"/>
+        </w:rPr>
+      </w:pPr>
+      <w:r>
+        <w:rPr>
+          <w:b/>
+          <w:bCs/>
+          <w:sz w:val="27"/>
+          <w:szCs w:val="27"/>
+        </w:rPr>
+        <w:t xml:space="preserve">Why write the absolute value </w:t>
+      </w:r>
+      <w:r>
+        <w:rPr>
+          <w:rFonts w:ascii="Courier New" w:hAnsi="Courier New" w:cs="Courier New"/>
+          <w:b/>
+          <w:bCs/>
+          <w:sz w:val="20"/>
+          <w:szCs w:val="20"/>
+        </w:rPr>
+        <w:t>2</w:t>
+      </w:r>
+      <w:r>
+        <w:rPr>
+          <w:b/>
+          <w:bCs/>
+          <w:sz w:val="27"/>
+          <w:szCs w:val="27"/>
+        </w:rPr>
+        <w:t>?</w:t>
+      </w:r>
+    </w:p>
+    <w:p>
+      <w:pPr>
+        <w:spacing w:before="100" w:beforeAutospacing="1" w:after="100" w:afterAutospacing="1"/>
+      </w:pPr>
+      <w:r>
+        <w:t>Suppose Gold used this operation:</w:t>
+      </w:r>
+    </w:p>
+    <w:p>
+      <w:pPr>
+        <w:tabs>
+          <w:tab w:val="left" w:pos="916"/>
+          <w:tab w:val="left" w:pos="1832"/>
+          <w:tab w:val="left" w:pos="2748"/>
+          <w:tab w:val="left" w:pos="3664"/>
+          <w:tab w:val="left" w:pos="4580"/>
+          <w:tab w:val="left" w:pos="5496"/>
+          <w:tab w:val="left" w:pos="6412"/>
+          <w:tab w:val="left" w:pos="7328"/>
+          <w:tab w:val="left" w:pos="8244"/>
+          <w:tab w:val="left" w:pos="9160"/>
+          <w:tab w:val="left" w:pos="10076"/>
+          <w:tab w:val="left" w:pos="10992"/>
+          <w:tab w:val="left" w:pos="11908"/>
+          <w:tab w:val="left" w:pos="12824"/>
+          <w:tab w:val="left" w:pos="13740"/>
+          <w:tab w:val="left" w:pos="14656"/>
+        </w:tabs>
+        <w:rPr>
+          <w:rFonts w:ascii="Courier New" w:hAnsi="Courier New" w:cs="Courier New"/>
+          <w:sz w:val="20"/>
+          <w:szCs w:val="20"/>
+        </w:rPr>
+      </w:pPr>
+      <w:proofErr w:type="spellStart"/>
+      <w:r>
+        <w:rPr>
+          <w:rFonts w:ascii="Courier New" w:hAnsi="Courier New" w:cs="Courier New"/>
+          <w:sz w:val="20"/>
+          <w:szCs w:val="20"/>
+        </w:rPr>
+        <w:t>event_count</w:t>
+      </w:r>
+      <w:proofErr w:type="spellEnd"/>
+      <w:r>
+        <w:rPr>
+          <w:rFonts w:ascii="Courier New" w:hAnsi="Courier New" w:cs="Courier New"/>
+          <w:sz w:val="20"/>
+          <w:szCs w:val="20"/>
+        </w:rPr>
+        <w:t xml:space="preserve"> = </w:t>
+      </w:r>
+      <w:proofErr w:type="spellStart"/>
+      <w:r>
+        <w:rPr>
+          <w:rFonts w:ascii="Courier New" w:hAnsi="Courier New" w:cs="Courier New"/>
+          <w:sz w:val="20"/>
+          <w:szCs w:val="20"/>
+        </w:rPr>
+        <w:t>event_count</w:t>
+      </w:r>
+      <w:proofErr w:type="spellEnd"/>
+      <w:r>
+        <w:rPr>
+          <w:rFonts w:ascii="Courier New" w:hAnsi="Courier New" w:cs="Courier New"/>
+          <w:sz w:val="20"/>
+          <w:szCs w:val="20"/>
+        </w:rPr>
+        <w:t xml:space="preserve"> + 1</w:t>
+      </w:r>
+    </w:p>
+    <w:p>
+      <w:pPr>
+        <w:spacing w:before="100" w:beforeAutospacing="1" w:after="100" w:afterAutospacing="1"/>
+      </w:pPr>
+      <w:r>
+        <w:t>The first E2 processing changes the count:</w:t>
+      </w:r>
+    </w:p>
+    <w:p>
+      <w:pPr>
+        <w:tabs>
+          <w:tab w:val="left" w:pos="916"/>
+          <w:tab w:val="left" w:pos="1832"/>
+          <w:tab w:val="left" w:pos="2748"/>
+          <w:tab w:val="left" w:pos="3664"/>
+          <w:tab w:val="left" w:pos="4580"/>
+          <w:tab w:val="left" w:pos="5496"/>
+          <w:tab w:val="left" w:pos="6412"/>
+          <w:tab w:val="left" w:pos="7328"/>
+          <w:tab w:val="left" w:pos="8244"/>
+          <w:tab w:val="left" w:pos="9160"/>
+          <w:tab w:val="left" w:pos="10076"/>
+          <w:tab w:val="left" w:pos="10992"/>
+          <w:tab w:val="left" w:pos="11908"/>
+          <w:tab w:val="left" w:pos="12824"/>
+          <w:tab w:val="left" w:pos="13740"/>
+          <w:tab w:val="left" w:pos="14656"/>
+        </w:tabs>
+        <w:rPr>
+          <w:rFonts w:ascii="Courier New" w:hAnsi="Courier New" w:cs="Courier New"/>
+          <w:sz w:val="20"/>
+          <w:szCs w:val="20"/>
+        </w:rPr>
+      </w:pPr>
+      <w:r>
+        <w:rPr>
+          <w:rFonts w:ascii="Courier New" w:hAnsi="Courier New" w:cs="Courier New"/>
+          <w:sz w:val="20"/>
+          <w:szCs w:val="20"/>
+        </w:rPr>
+        <w:t>1 + 1 = 2</w:t>
+      </w:r>
+    </w:p>
+    <w:p>
+      <w:pPr>
+        <w:spacing w:before="100" w:beforeAutospacing="1" w:after="100" w:afterAutospacing="1"/>
+      </w:pPr>
+      <w:r>
+        <w:t xml:space="preserve">But if the </w:t>
+      </w:r>
+      <w:proofErr w:type="gramStart"/>
+      <w:r>
+        <w:t>Gold</w:t>
+      </w:r>
+      <w:proofErr w:type="gramEnd"/>
+      <w:r>
+        <w:t xml:space="preserve"> job writes </w:t>
+      </w:r>
+      <w:r>
+        <w:rPr>
+          <w:rFonts w:ascii="Courier New" w:hAnsi="Courier New" w:cs="Courier New"/>
+          <w:sz w:val="20"/>
+          <w:szCs w:val="20"/>
+        </w:rPr>
+        <w:t>2</w:t>
+      </w:r>
+      <w:r>
+        <w:t>, crashes before checkpointing, and processes E2 again:</w:t>
+      </w:r>
+    </w:p>
+    <w:p>
+      <w:pPr>
+        <w:tabs>
+          <w:tab w:val="left" w:pos="916"/>
+          <w:tab w:val="left" w:pos="1832"/>
+          <w:tab w:val="left" w:pos="2748"/>
+          <w:tab w:val="left" w:pos="3664"/>
+          <w:tab w:val="left" w:pos="4580"/>
+          <w:tab w:val="left" w:pos="5496"/>
+          <w:tab w:val="left" w:pos="6412"/>
+          <w:tab w:val="left" w:pos="7328"/>
+          <w:tab w:val="left" w:pos="8244"/>
+          <w:tab w:val="left" w:pos="9160"/>
+          <w:tab w:val="left" w:pos="10076"/>
+          <w:tab w:val="left" w:pos="10992"/>
+          <w:tab w:val="left" w:pos="11908"/>
+          <w:tab w:val="left" w:pos="12824"/>
+          <w:tab w:val="left" w:pos="13740"/>
+          <w:tab w:val="left" w:pos="14656"/>
+        </w:tabs>
+        <w:rPr>
+          <w:rFonts w:ascii="Courier New" w:hAnsi="Courier New" w:cs="Courier New"/>
+          <w:sz w:val="20"/>
+          <w:szCs w:val="20"/>
+        </w:rPr>
+      </w:pPr>
+      <w:r>
+        <w:rPr>
+          <w:rFonts w:ascii="Courier New" w:hAnsi="Courier New" w:cs="Courier New"/>
+          <w:sz w:val="20"/>
+          <w:szCs w:val="20"/>
+        </w:rPr>
+        <w:t xml:space="preserve">2 + 1 = </w:t>
+      </w:r>
+      <w:proofErr w:type="gramStart"/>
+      <w:r>
+        <w:rPr>
+          <w:rFonts w:ascii="Courier New" w:hAnsi="Courier New" w:cs="Courier New"/>
+          <w:sz w:val="20"/>
+          <w:szCs w:val="20"/>
+        </w:rPr>
+        <w:t xml:space="preserve">3  </w:t>
+      </w:r>
+      <w:r>
+        <w:rPr>
+          <w:rFonts w:ascii="Apple Color Emoji" w:hAnsi="Apple Color Emoji" w:cs="Apple Color Emoji"/>
+          <w:sz w:val="20"/>
+          <w:szCs w:val="20"/>
+        </w:rPr>
+        <w:t>❌</w:t>
+      </w:r>
+      <w:proofErr w:type="gramEnd"/>
+    </w:p>
+    <w:p>
+      <w:pPr>
+        <w:spacing w:before="100" w:beforeAutospacing="1" w:after="100" w:afterAutospacing="1"/>
+      </w:pPr>
+      <w:r>
+        <w:t>Instead, Spark can calculate the affected window from deduplicated Silver:</w:t>
+      </w:r>
+    </w:p>
+    <w:p>
+      <w:pPr>
+        <w:tabs>
+          <w:tab w:val="left" w:pos="916"/>
+          <w:tab w:val="left" w:pos="1832"/>
+          <w:tab w:val="left" w:pos="2748"/>
+          <w:tab w:val="left" w:pos="3664"/>
+          <w:tab w:val="left" w:pos="4580"/>
+          <w:tab w:val="left" w:pos="5496"/>
+          <w:tab w:val="left" w:pos="6412"/>
+          <w:tab w:val="left" w:pos="7328"/>
+          <w:tab w:val="left" w:pos="8244"/>
+          <w:tab w:val="left" w:pos="9160"/>
+          <w:tab w:val="left" w:pos="10076"/>
+          <w:tab w:val="left" w:pos="10992"/>
+          <w:tab w:val="left" w:pos="11908"/>
+          <w:tab w:val="left" w:pos="12824"/>
+          <w:tab w:val="left" w:pos="13740"/>
+          <w:tab w:val="left" w:pos="14656"/>
+        </w:tabs>
+        <w:rPr>
+          <w:rFonts w:ascii="Courier New" w:hAnsi="Courier New" w:cs="Courier New"/>
+          <w:sz w:val="20"/>
+          <w:szCs w:val="20"/>
+        </w:rPr>
+      </w:pPr>
+      <w:r>
+        <w:rPr>
+          <w:rFonts w:ascii="Courier New" w:hAnsi="Courier New" w:cs="Courier New"/>
+          <w:sz w:val="20"/>
+          <w:szCs w:val="20"/>
+        </w:rPr>
+        <w:t>SELECT</w:t>
+      </w:r>
+    </w:p>
+    <w:p>
+      <w:pPr>
+        <w:tabs>
+          <w:tab w:val="left" w:pos="916"/>
+          <w:tab w:val="left" w:pos="1832"/>
+          <w:tab w:val="left" w:pos="2748"/>
+          <w:tab w:val="left" w:pos="3664"/>
+          <w:tab w:val="left" w:pos="4580"/>
+          <w:tab w:val="left" w:pos="5496"/>
+          <w:tab w:val="left" w:pos="6412"/>
+          <w:tab w:val="left" w:pos="7328"/>
+          <w:tab w:val="left" w:pos="8244"/>
+          <w:tab w:val="left" w:pos="9160"/>
+          <w:tab w:val="left" w:pos="10076"/>
+          <w:tab w:val="left" w:pos="10992"/>
+          <w:tab w:val="left" w:pos="11908"/>
+          <w:tab w:val="left" w:pos="12824"/>
+          <w:tab w:val="left" w:pos="13740"/>
+          <w:tab w:val="left" w:pos="14656"/>
+        </w:tabs>
+        <w:rPr>
+          <w:rFonts w:ascii="Courier New" w:hAnsi="Courier New" w:cs="Courier New"/>
+          <w:sz w:val="20"/>
+          <w:szCs w:val="20"/>
+        </w:rPr>
+      </w:pPr>
+      <w:r>
+        <w:rPr>
+          <w:rFonts w:ascii="Courier New" w:hAnsi="Courier New" w:cs="Courier New"/>
+          <w:sz w:val="20"/>
+          <w:szCs w:val="20"/>
+        </w:rPr>
+        <w:t xml:space="preserve">    </w:t>
+      </w:r>
+      <w:proofErr w:type="spellStart"/>
+      <w:r>
+        <w:rPr>
+          <w:rFonts w:ascii="Courier New" w:hAnsi="Courier New" w:cs="Courier New"/>
+          <w:sz w:val="20"/>
+          <w:szCs w:val="20"/>
+        </w:rPr>
+        <w:t>window_start</w:t>
+      </w:r>
+      <w:proofErr w:type="spellEnd"/>
+      <w:r>
+        <w:rPr>
+          <w:rFonts w:ascii="Courier New" w:hAnsi="Courier New" w:cs="Courier New"/>
+          <w:sz w:val="20"/>
+          <w:szCs w:val="20"/>
+        </w:rPr>
+        <w:t>,</w:t>
+      </w:r>
+    </w:p>
+    <w:p>
+      <w:pPr>
+        <w:tabs>
+          <w:tab w:val="left" w:pos="916"/>
+          <w:tab w:val="left" w:pos="1832"/>
+          <w:tab w:val="left" w:pos="2748"/>
+          <w:tab w:val="left" w:pos="3664"/>
+          <w:tab w:val="left" w:pos="4580"/>
+          <w:tab w:val="left" w:pos="5496"/>
+          <w:tab w:val="left" w:pos="6412"/>
+          <w:tab w:val="left" w:pos="7328"/>
+          <w:tab w:val="left" w:pos="8244"/>
+          <w:tab w:val="left" w:pos="9160"/>
+          <w:tab w:val="left" w:pos="10076"/>
+          <w:tab w:val="left" w:pos="10992"/>
+          <w:tab w:val="left" w:pos="11908"/>
+          <w:tab w:val="left" w:pos="12824"/>
+          <w:tab w:val="left" w:pos="13740"/>
+          <w:tab w:val="left" w:pos="14656"/>
+        </w:tabs>
+        <w:rPr>
+          <w:rFonts w:ascii="Courier New" w:hAnsi="Courier New" w:cs="Courier New"/>
+          <w:sz w:val="20"/>
+          <w:szCs w:val="20"/>
+        </w:rPr>
+      </w:pPr>
+      <w:r>
+        <w:rPr>
+          <w:rFonts w:ascii="Courier New" w:hAnsi="Courier New" w:cs="Courier New"/>
+          <w:sz w:val="20"/>
+          <w:szCs w:val="20"/>
+        </w:rPr>
+        <w:t xml:space="preserve">    </w:t>
+      </w:r>
+      <w:proofErr w:type="gramStart"/>
+      <w:r>
+        <w:rPr>
+          <w:rFonts w:ascii="Courier New" w:hAnsi="Courier New" w:cs="Courier New"/>
+          <w:sz w:val="20"/>
+          <w:szCs w:val="20"/>
+        </w:rPr>
+        <w:t>COUNT(</w:t>
+      </w:r>
+      <w:proofErr w:type="gramEnd"/>
+      <w:r>
+        <w:rPr>
+          <w:rFonts w:ascii="Courier New" w:hAnsi="Courier New" w:cs="Courier New"/>
+          <w:sz w:val="20"/>
+          <w:szCs w:val="20"/>
+        </w:rPr>
+        <w:t xml:space="preserve">*) AS </w:t>
+      </w:r>
+      <w:proofErr w:type="spellStart"/>
+      <w:r>
+        <w:rPr>
+          <w:rFonts w:ascii="Courier New" w:hAnsi="Courier New" w:cs="Courier New"/>
+          <w:sz w:val="20"/>
+          <w:szCs w:val="20"/>
+        </w:rPr>
+        <w:t>event_count</w:t>
+      </w:r>
+      <w:proofErr w:type="spellEnd"/>
+    </w:p>
+    <w:p>
+      <w:pPr>
+        <w:tabs>
+          <w:tab w:val="left" w:pos="916"/>
+          <w:tab w:val="left" w:pos="1832"/>
+          <w:tab w:val="left" w:pos="2748"/>
+          <w:tab w:val="left" w:pos="3664"/>
+          <w:tab w:val="left" w:pos="4580"/>
+          <w:tab w:val="left" w:pos="5496"/>
+          <w:tab w:val="left" w:pos="6412"/>
+          <w:tab w:val="left" w:pos="7328"/>
+          <w:tab w:val="left" w:pos="8244"/>
+          <w:tab w:val="left" w:pos="9160"/>
+          <w:tab w:val="left" w:pos="10076"/>
+          <w:tab w:val="left" w:pos="10992"/>
+          <w:tab w:val="left" w:pos="11908"/>
+          <w:tab w:val="left" w:pos="12824"/>
+          <w:tab w:val="left" w:pos="13740"/>
+          <w:tab w:val="left" w:pos="14656"/>
+        </w:tabs>
+        <w:rPr>
+          <w:rFonts w:ascii="Courier New" w:hAnsi="Courier New" w:cs="Courier New"/>
+          <w:sz w:val="20"/>
+          <w:szCs w:val="20"/>
+        </w:rPr>
+      </w:pPr>
+      <w:r>
+        <w:rPr>
+          <w:rFonts w:ascii="Courier New" w:hAnsi="Courier New" w:cs="Courier New"/>
+          <w:sz w:val="20"/>
+          <w:szCs w:val="20"/>
+        </w:rPr>
+        <w:t xml:space="preserve">FROM </w:t>
+      </w:r>
+      <w:proofErr w:type="spellStart"/>
+      <w:r>
+        <w:rPr>
+          <w:rFonts w:ascii="Courier New" w:hAnsi="Courier New" w:cs="Courier New"/>
+          <w:sz w:val="20"/>
+          <w:szCs w:val="20"/>
+        </w:rPr>
+        <w:t>silver_events</w:t>
+      </w:r>
+      <w:proofErr w:type="spellEnd"/>
+    </w:p>
+    <w:p>
+      <w:pPr>
+        <w:tabs>
+          <w:tab w:val="left" w:pos="916"/>
+          <w:tab w:val="left" w:pos="1832"/>
+          <w:tab w:val="left" w:pos="2748"/>
+          <w:tab w:val="left" w:pos="3664"/>
+          <w:tab w:val="left" w:pos="4580"/>
+          <w:tab w:val="left" w:pos="5496"/>
+          <w:tab w:val="left" w:pos="6412"/>
+          <w:tab w:val="left" w:pos="7328"/>
+          <w:tab w:val="left" w:pos="8244"/>
+          <w:tab w:val="left" w:pos="9160"/>
+          <w:tab w:val="left" w:pos="10076"/>
+          <w:tab w:val="left" w:pos="10992"/>
+          <w:tab w:val="left" w:pos="11908"/>
+          <w:tab w:val="left" w:pos="12824"/>
+          <w:tab w:val="left" w:pos="13740"/>
+          <w:tab w:val="left" w:pos="14656"/>
+        </w:tabs>
+        <w:rPr>
+          <w:rFonts w:ascii="Courier New" w:hAnsi="Courier New" w:cs="Courier New"/>
+          <w:sz w:val="20"/>
+          <w:szCs w:val="20"/>
+        </w:rPr>
+      </w:pPr>
+      <w:r>
+        <w:rPr>
+          <w:rFonts w:ascii="Courier New" w:hAnsi="Courier New" w:cs="Courier New"/>
+          <w:sz w:val="20"/>
+          <w:szCs w:val="20"/>
+        </w:rPr>
+        <w:t xml:space="preserve">WHERE </w:t>
+      </w:r>
+      <w:proofErr w:type="spellStart"/>
+      <w:r>
+        <w:rPr>
+          <w:rFonts w:ascii="Courier New" w:hAnsi="Courier New" w:cs="Courier New"/>
+          <w:sz w:val="20"/>
+          <w:szCs w:val="20"/>
+        </w:rPr>
         <w:t>event_time</w:t>
       </w:r>
       <w:proofErr w:type="spellEnd"/>
       <w:r>
-        <w:t xml:space="preserve"> and put in window of 10:00 – 10:</w:t>
+        <w:rPr>
+          <w:rFonts w:ascii="Courier New" w:hAnsi="Courier New" w:cs="Courier New"/>
+          <w:sz w:val="20"/>
+          <w:szCs w:val="20"/>
+        </w:rPr>
+        <w:t xml:space="preserve"> &gt;= '10:00'</w:t>
+      </w:r>
+    </w:p>
+    <w:p>
+      <w:pPr>
+        <w:tabs>
+          <w:tab w:val="left" w:pos="916"/>
+          <w:tab w:val="left" w:pos="1832"/>
+          <w:tab w:val="left" w:pos="2748"/>
+          <w:tab w:val="left" w:pos="3664"/>
+          <w:tab w:val="left" w:pos="4580"/>
+          <w:tab w:val="left" w:pos="5496"/>
+          <w:tab w:val="left" w:pos="6412"/>
+          <w:tab w:val="left" w:pos="7328"/>
+          <w:tab w:val="left" w:pos="8244"/>
+          <w:tab w:val="left" w:pos="9160"/>
+          <w:tab w:val="left" w:pos="10076"/>
+          <w:tab w:val="left" w:pos="10992"/>
+          <w:tab w:val="left" w:pos="11908"/>
+          <w:tab w:val="left" w:pos="12824"/>
+          <w:tab w:val="left" w:pos="13740"/>
+          <w:tab w:val="left" w:pos="14656"/>
+        </w:tabs>
+        <w:rPr>
+          <w:rFonts w:ascii="Courier New" w:hAnsi="Courier New" w:cs="Courier New"/>
+          <w:sz w:val="20"/>
+          <w:szCs w:val="20"/>
+        </w:rPr>
+      </w:pPr>
+      <w:r>
+        <w:rPr>
+          <w:rFonts w:ascii="Courier New" w:hAnsi="Courier New" w:cs="Courier New"/>
+          <w:sz w:val="20"/>
+          <w:szCs w:val="20"/>
+        </w:rPr>
+        <w:t xml:space="preserve">  AND </w:t>
+      </w:r>
+      <w:proofErr w:type="spellStart"/>
+      <w:r>
+        <w:rPr>
+          <w:rFonts w:ascii="Courier New" w:hAnsi="Courier New" w:cs="Courier New"/>
+          <w:sz w:val="20"/>
+          <w:szCs w:val="20"/>
+        </w:rPr>
+        <w:t>event_time</w:t>
+      </w:r>
+      <w:proofErr w:type="spellEnd"/>
+      <w:r>
+        <w:rPr>
+          <w:rFonts w:ascii="Courier New" w:hAnsi="Courier New" w:cs="Courier New"/>
+          <w:sz w:val="20"/>
+          <w:szCs w:val="20"/>
+        </w:rPr>
+        <w:t xml:space="preserve"> </w:t>
       </w:r>
       <w:proofErr w:type="gramStart"/>
       <w:r>
-        <w:t>05 .</w:t>
+        <w:rPr>
+          <w:rFonts w:ascii="Courier New" w:hAnsi="Courier New" w:cs="Courier New"/>
+          <w:sz w:val="20"/>
+          <w:szCs w:val="20"/>
+        </w:rPr>
+        <w:t>&lt;  '</w:t>
       </w:r>
       <w:proofErr w:type="gramEnd"/>
       <w:r>
-        <w:t xml:space="preserve"> Before </w:t>
+        <w:rPr>
+          <w:rFonts w:ascii="Courier New" w:hAnsi="Courier New" w:cs="Courier New"/>
+          <w:sz w:val="20"/>
+          <w:szCs w:val="20"/>
+        </w:rPr>
+        <w:t>10:05'</w:t>
+      </w:r>
+    </w:p>
+    <w:p>
+      <w:pPr>
+        <w:tabs>
+          <w:tab w:val="left" w:pos="916"/>
+          <w:tab w:val="left" w:pos="1832"/>
+          <w:tab w:val="left" w:pos="2748"/>
+          <w:tab w:val="left" w:pos="3664"/>
+          <w:tab w:val="left" w:pos="4580"/>
+          <w:tab w:val="left" w:pos="5496"/>
+          <w:tab w:val="left" w:pos="6412"/>
+          <w:tab w:val="left" w:pos="7328"/>
+          <w:tab w:val="left" w:pos="8244"/>
+          <w:tab w:val="left" w:pos="9160"/>
+          <w:tab w:val="left" w:pos="10076"/>
+          <w:tab w:val="left" w:pos="10992"/>
+          <w:tab w:val="left" w:pos="11908"/>
+          <w:tab w:val="left" w:pos="12824"/>
+          <w:tab w:val="left" w:pos="13740"/>
+          <w:tab w:val="left" w:pos="14656"/>
+        </w:tabs>
+        <w:rPr>
+          <w:rFonts w:ascii="Courier New" w:hAnsi="Courier New" w:cs="Courier New"/>
+          <w:sz w:val="20"/>
+          <w:szCs w:val="20"/>
+        </w:rPr>
+      </w:pPr>
+      <w:r>
+        <w:rPr>
+          <w:rFonts w:ascii="Courier New" w:hAnsi="Courier New" w:cs="Courier New"/>
+          <w:sz w:val="20"/>
+          <w:szCs w:val="20"/>
+        </w:rPr>
+        <w:t xml:space="preserve">GROUP BY </w:t>
       </w:r>
       <w:proofErr w:type="spellStart"/>
       <w:r>
-        <w:t>agg</w:t>
+        <w:rPr>
+          <w:rFonts w:ascii="Courier New" w:hAnsi="Courier New" w:cs="Courier New"/>
+          <w:sz w:val="20"/>
+          <w:szCs w:val="20"/>
+        </w:rPr>
+        <w:t>window_start</w:t>
       </w:r>
       <w:proofErr w:type="spellEnd"/>
       <w:r>
-        <w:t xml:space="preserve"> was count 1 now count 2 </w:t>
-      </w:r>
+        <w:rPr>
+          <w:rFonts w:ascii="Courier New" w:hAnsi="Courier New" w:cs="Courier New"/>
+          <w:sz w:val="20"/>
+          <w:szCs w:val="20"/>
+        </w:rPr>
+        <w:t>;</w:t>
+      </w:r>
+    </w:p>
+    <w:p>
+      <w:pPr>
+        <w:spacing w:before="100" w:beforeAutospacing="1" w:after="100" w:afterAutospacing="1"/>
+      </w:pPr>
+      <w:r>
+        <w:lastRenderedPageBreak/>
+        <w:t xml:space="preserve">That calculation always returns </w:t>
+      </w:r>
+      <w:r>
+        <w:rPr>
+          <w:rFonts w:ascii="Courier New" w:hAnsi="Courier New" w:cs="Courier New"/>
+          <w:sz w:val="20"/>
+          <w:szCs w:val="20"/>
+        </w:rPr>
+        <w:t>2</w:t>
+      </w:r>
+      <w:r>
+        <w:t>, because Silver contains exactly E1 and E2 once each. Gold then performs:</w:t>
+      </w:r>
+    </w:p>
+    <w:p>
+      <w:pPr>
+        <w:tabs>
+          <w:tab w:val="left" w:pos="916"/>
+          <w:tab w:val="left" w:pos="1832"/>
+          <w:tab w:val="left" w:pos="2748"/>
+          <w:tab w:val="left" w:pos="3664"/>
+          <w:tab w:val="left" w:pos="4580"/>
+          <w:tab w:val="left" w:pos="5496"/>
+          <w:tab w:val="left" w:pos="6412"/>
+          <w:tab w:val="left" w:pos="7328"/>
+          <w:tab w:val="left" w:pos="8244"/>
+          <w:tab w:val="left" w:pos="9160"/>
+          <w:tab w:val="left" w:pos="10076"/>
+          <w:tab w:val="left" w:pos="10992"/>
+          <w:tab w:val="left" w:pos="11908"/>
+          <w:tab w:val="left" w:pos="12824"/>
+          <w:tab w:val="left" w:pos="13740"/>
+          <w:tab w:val="left" w:pos="14656"/>
+        </w:tabs>
+        <w:rPr>
+          <w:rFonts w:ascii="Courier New" w:hAnsi="Courier New" w:cs="Courier New"/>
+          <w:sz w:val="20"/>
+          <w:szCs w:val="20"/>
+        </w:rPr>
+      </w:pPr>
+      <w:r>
+        <w:rPr>
+          <w:rFonts w:ascii="Courier New" w:hAnsi="Courier New" w:cs="Courier New"/>
+          <w:sz w:val="20"/>
+          <w:szCs w:val="20"/>
+        </w:rPr>
+        <w:t>First attempt:  set count = 2</w:t>
+      </w:r>
+    </w:p>
+    <w:p>
+      <w:pPr>
+        <w:tabs>
+          <w:tab w:val="left" w:pos="916"/>
+          <w:tab w:val="left" w:pos="1832"/>
+          <w:tab w:val="left" w:pos="2748"/>
+          <w:tab w:val="left" w:pos="3664"/>
+          <w:tab w:val="left" w:pos="4580"/>
+          <w:tab w:val="left" w:pos="5496"/>
+          <w:tab w:val="left" w:pos="6412"/>
+          <w:tab w:val="left" w:pos="7328"/>
+          <w:tab w:val="left" w:pos="8244"/>
+          <w:tab w:val="left" w:pos="9160"/>
+          <w:tab w:val="left" w:pos="10076"/>
+          <w:tab w:val="left" w:pos="10992"/>
+          <w:tab w:val="left" w:pos="11908"/>
+          <w:tab w:val="left" w:pos="12824"/>
+          <w:tab w:val="left" w:pos="13740"/>
+          <w:tab w:val="left" w:pos="14656"/>
+        </w:tabs>
+        <w:rPr>
+          <w:rFonts w:ascii="Courier New" w:hAnsi="Courier New" w:cs="Courier New"/>
+          <w:sz w:val="20"/>
+          <w:szCs w:val="20"/>
+        </w:rPr>
+      </w:pPr>
+      <w:r>
+        <w:rPr>
+          <w:rFonts w:ascii="Courier New" w:hAnsi="Courier New" w:cs="Courier New"/>
+          <w:sz w:val="20"/>
+          <w:szCs w:val="20"/>
+        </w:rPr>
+        <w:t>Retry:          set count = 2</w:t>
+      </w:r>
+    </w:p>
+    <w:p>
+      <w:pPr>
+        <w:spacing w:before="100" w:beforeAutospacing="1" w:after="100" w:afterAutospacing="1"/>
+      </w:pPr>
+      <w:r>
+        <w:t>That is why it is idempotent.</w:t>
+      </w:r>
+    </w:p>
+    <w:p>
+      <w:pPr>
+        <w:spacing w:before="100" w:beforeAutospacing="1" w:after="100" w:afterAutospacing="1"/>
+      </w:pPr>
+      <w:r>
+        <w:t xml:space="preserve">So “recompute the window” means recompute only the affected </w:t>
+      </w:r>
+      <w:r>
+        <w:rPr>
+          <w:b/>
+          <w:bCs/>
+        </w:rPr>
+        <w:t>10:00–10:05 window from Silver</w:t>
+      </w:r>
+      <w:r>
+        <w:t xml:space="preserve">, not recompute the entire </w:t>
+      </w:r>
+      <w:proofErr w:type="gramStart"/>
+      <w:r>
+        <w:t>Gold</w:t>
+      </w:r>
+      <w:proofErr w:type="gramEnd"/>
+      <w:r>
+        <w:t xml:space="preserve"> table.</w:t>
+      </w:r>
+    </w:p>
+    <w:p>
+      <w:pPr>
+        <w:tabs>
+          <w:tab w:val="left" w:pos="5737"/>
+        </w:tabs>
+      </w:pPr>
     </w:p>
     <w:sectPr>
       <w:pgSz w:w="12240" w:h="15840"/>
@@ -12697,7 +14486,6 @@
     <w:next w:val="Normal"/>
     <w:link w:val="Heading3Char"/>
     <w:uiPriority w:val="9"/>
-    <w:semiHidden/>
     <w:unhideWhenUsed/>
     <w:qFormat/>
     <w:rsid w:val="0074468F"/>
@@ -12903,7 +14691,6 @@
     <w:basedOn w:val="DefaultParagraphFont"/>
     <w:link w:val="Heading3"/>
     <w:uiPriority w:val="9"/>
-    <w:semiHidden/>
     <w:rsid w:val="0074468F"/>
     <w:rPr>
       <w:rFonts w:eastAsiaTheme="majorEastAsia" w:cstheme="majorBidi"/>

</xml_diff>